<commit_message>
chore: modification du rapport
</commit_message>
<xml_diff>
--- a/rapport/Rapport.docx
+++ b/rapport/Rapport.docx
@@ -5,37 +5,50 @@
     <w:p>
       <w:pPr>
         <w:pStyle w:val="Titre"/>
-        <w:rPr>
-          <w:lang w:val="en-GB"/>
+        <w:spacing w:before="240" w:after="240" w:line="360" w:lineRule="auto"/>
+        <w:rPr>
+          <w:lang w:val="fr-SN"/>
         </w:rPr>
       </w:pPr>
       <w:r>
         <w:rPr>
-          <w:lang w:val="en-GB"/>
-        </w:rPr>
-        <w:t>PLATEFORME BIG DATA PRÉDICTIVE "AGRI-INSIGHT SN"</w:t>
+          <w:sz w:val="25"/>
+          <w:lang w:val="fr-SN"/>
+        </w:rPr>
+        <w:t xml:space="preserve"> </w:t>
+      </w:r>
+      <w:r>
+        <w:rPr>
+          <w:sz w:val="25"/>
+          <w:lang w:val="fr-SN"/>
+        </w:rPr>
+        <w:t>RAPPORT MIS À JOUR - VERSION 8 PAGESPLATEFORME BIG DATA PRÉDICTIVE "AGRI-INSIGHT SN"</w:t>
       </w:r>
     </w:p>
     <w:p>
       <w:pPr>
+        <w:spacing w:before="240" w:after="240" w:line="360" w:lineRule="auto"/>
         <w:rPr>
           <w:lang w:val="fr-SN"/>
         </w:rPr>
       </w:pPr>
       <w:r>
         <w:rPr>
+          <w:sz w:val="25"/>
           <w:lang w:val="fr-SN"/>
         </w:rPr>
         <w:t xml:space="preserve">Auteur : </w:t>
       </w:r>
       <w:r>
         <w:rPr>
+          <w:sz w:val="25"/>
           <w:lang w:val="fr-SN"/>
         </w:rPr>
         <w:t>Malick COLY</w:t>
       </w:r>
       <w:r>
         <w:rPr>
+          <w:sz w:val="25"/>
           <w:lang w:val="fr-SN"/>
         </w:rPr>
         <w:t xml:space="preserve">  </w:t>
@@ -43,24 +56,28 @@
     </w:p>
     <w:p>
       <w:pPr>
+        <w:spacing w:before="240" w:after="240" w:line="360" w:lineRule="auto"/>
         <w:rPr>
           <w:lang w:val="fr-SN"/>
         </w:rPr>
       </w:pPr>
       <w:r>
         <w:rPr>
+          <w:sz w:val="25"/>
           <w:lang w:val="fr-SN"/>
         </w:rPr>
         <w:t xml:space="preserve">Niveau : Master 2 </w:t>
       </w:r>
       <w:r>
         <w:rPr>
+          <w:sz w:val="25"/>
           <w:lang w:val="fr-SN"/>
         </w:rPr>
         <w:t>Data Science et Génie Logiciel</w:t>
       </w:r>
       <w:r>
         <w:rPr>
+          <w:sz w:val="25"/>
           <w:lang w:val="fr-SN"/>
         </w:rPr>
         <w:t xml:space="preserve">  </w:t>
@@ -68,12 +85,14 @@
     </w:p>
     <w:p>
       <w:pPr>
+        <w:spacing w:before="240" w:after="240" w:line="360" w:lineRule="auto"/>
         <w:rPr>
           <w:lang w:val="fr-SN"/>
         </w:rPr>
       </w:pPr>
       <w:r>
         <w:rPr>
+          <w:sz w:val="25"/>
           <w:lang w:val="fr-SN"/>
         </w:rPr>
         <w:t xml:space="preserve">Établissement : Université Alioune Diop de Bambey (UADB)  </w:t>
@@ -81,48 +100,23 @@
     </w:p>
     <w:p>
       <w:pPr>
-        <w:rPr>
-          <w:lang w:val="en-GB"/>
+        <w:spacing w:before="240" w:after="240" w:line="360" w:lineRule="auto"/>
+        <w:rPr>
+          <w:lang w:val="fr-SN"/>
         </w:rPr>
       </w:pPr>
-      <w:proofErr w:type="spellStart"/>
-      <w:proofErr w:type="gramStart"/>
       <w:r>
         <w:rPr>
-          <w:lang w:val="en-GB"/>
-        </w:rPr>
-        <w:t>Professeur</w:t>
-      </w:r>
-      <w:proofErr w:type="spellEnd"/>
-      <w:r>
-        <w:rPr>
-          <w:lang w:val="en-GB"/>
-        </w:rPr>
-        <w:t xml:space="preserve"> :</w:t>
-      </w:r>
-      <w:proofErr w:type="gramEnd"/>
-      <w:r>
-        <w:rPr>
-          <w:lang w:val="en-GB"/>
-        </w:rPr>
-        <w:t xml:space="preserve"> </w:t>
-      </w:r>
-      <w:r>
-        <w:rPr>
-          <w:lang w:val="en-GB"/>
-        </w:rPr>
-        <w:t xml:space="preserve">Mr </w:t>
-      </w:r>
-      <w:r>
-        <w:rPr>
-          <w:lang w:val="en-GB"/>
-        </w:rPr>
-        <w:t>SEYE</w:t>
+          <w:sz w:val="25"/>
+          <w:lang w:val="fr-SN"/>
+        </w:rPr>
+        <w:t>Professeur : Mr SEYE</w:t>
       </w:r>
     </w:p>
     <w:p>
       <w:pPr>
         <w:pStyle w:val="Titre1"/>
+        <w:spacing w:before="240" w:after="240" w:line="360" w:lineRule="auto"/>
         <w:rPr>
           <w:lang w:val="fr-SN"/>
         </w:rPr>
@@ -136,12 +130,14 @@
     </w:p>
     <w:p>
       <w:pPr>
+        <w:spacing w:before="240" w:after="240" w:line="360" w:lineRule="auto"/>
         <w:rPr>
           <w:lang w:val="fr-SN"/>
         </w:rPr>
       </w:pPr>
       <w:r>
         <w:rPr>
+          <w:sz w:val="25"/>
           <w:lang w:val="fr-SN"/>
         </w:rPr>
         <w:t>1. Introduction</w:t>
@@ -149,12 +145,14 @@
     </w:p>
     <w:p>
       <w:pPr>
+        <w:spacing w:before="240" w:after="240" w:line="360" w:lineRule="auto"/>
         <w:rPr>
           <w:lang w:val="fr-SN"/>
         </w:rPr>
       </w:pPr>
       <w:r>
         <w:rPr>
+          <w:sz w:val="25"/>
           <w:lang w:val="fr-SN"/>
         </w:rPr>
         <w:t>2. Analyse du Besoin et Objectifs</w:t>
@@ -162,12 +160,14 @@
     </w:p>
     <w:p>
       <w:pPr>
+        <w:spacing w:before="240" w:after="240" w:line="360" w:lineRule="auto"/>
         <w:rPr>
           <w:lang w:val="fr-SN"/>
         </w:rPr>
       </w:pPr>
       <w:r>
         <w:rPr>
+          <w:sz w:val="25"/>
           <w:lang w:val="fr-SN"/>
         </w:rPr>
         <w:t>3. Architecture Technique et Infrastructure</w:t>
@@ -175,12 +175,14 @@
     </w:p>
     <w:p>
       <w:pPr>
+        <w:spacing w:before="240" w:after="240" w:line="360" w:lineRule="auto"/>
         <w:rPr>
           <w:lang w:val="fr-SN"/>
         </w:rPr>
       </w:pPr>
       <w:r>
         <w:rPr>
+          <w:sz w:val="25"/>
           <w:lang w:val="fr-SN"/>
         </w:rPr>
         <w:t>4. Ingestion et Flux de Données (</w:t>
@@ -188,6 +190,7 @@
       <w:proofErr w:type="spellStart"/>
       <w:r>
         <w:rPr>
+          <w:sz w:val="25"/>
           <w:lang w:val="fr-SN"/>
         </w:rPr>
         <w:t>NiFi</w:t>
@@ -195,6 +198,7 @@
       <w:proofErr w:type="spellEnd"/>
       <w:r>
         <w:rPr>
+          <w:sz w:val="25"/>
           <w:lang w:val="fr-SN"/>
         </w:rPr>
         <w:t>)</w:t>
@@ -202,69 +206,157 @@
     </w:p>
     <w:p>
       <w:pPr>
+        <w:spacing w:before="240" w:after="240" w:line="360" w:lineRule="auto"/>
         <w:rPr>
           <w:lang w:val="fr-SN"/>
         </w:rPr>
       </w:pPr>
       <w:r>
         <w:rPr>
+          <w:sz w:val="25"/>
           <w:lang w:val="fr-SN"/>
         </w:rPr>
         <w:t>5. Stockage et Architecture Médaillon (HDFS)</w:t>
       </w:r>
     </w:p>
     <w:p>
+      <w:pPr>
+        <w:spacing w:before="240" w:after="240" w:line="360" w:lineRule="auto"/>
+      </w:pPr>
       <w:r>
+        <w:rPr>
+          <w:sz w:val="25"/>
+        </w:rPr>
         <w:t>6. Traitement et Feature Engineering (Spark)</w:t>
       </w:r>
     </w:p>
     <w:p>
+      <w:pPr>
+        <w:spacing w:before="240" w:after="240" w:line="360" w:lineRule="auto"/>
+      </w:pPr>
       <w:r>
+        <w:rPr>
+          <w:sz w:val="25"/>
+        </w:rPr>
         <w:t xml:space="preserve">7. Machine Learning et </w:t>
       </w:r>
       <w:proofErr w:type="spellStart"/>
       <w:r>
+        <w:rPr>
+          <w:sz w:val="25"/>
+        </w:rPr>
         <w:t>MLOps</w:t>
       </w:r>
       <w:proofErr w:type="spellEnd"/>
       <w:r>
+        <w:rPr>
+          <w:sz w:val="25"/>
+        </w:rPr>
         <w:t xml:space="preserve"> (Spark </w:t>
       </w:r>
       <w:proofErr w:type="spellStart"/>
       <w:r>
+        <w:rPr>
+          <w:sz w:val="25"/>
+        </w:rPr>
         <w:t>MLlib</w:t>
       </w:r>
       <w:proofErr w:type="spellEnd"/>
       <w:r>
+        <w:rPr>
+          <w:sz w:val="25"/>
+        </w:rPr>
         <w:t>)</w:t>
       </w:r>
     </w:p>
     <w:p>
+      <w:pPr>
+        <w:spacing w:before="240" w:after="240" w:line="360" w:lineRule="auto"/>
+        <w:rPr>
+          <w:lang w:val="fr-SN"/>
+        </w:rPr>
+      </w:pPr>
       <w:r>
-        <w:t xml:space="preserve">8. Orchestration et </w:t>
+        <w:rPr>
+          <w:sz w:val="25"/>
+          <w:lang w:val="fr-SN"/>
+        </w:rPr>
+        <w:t>8. Orchestration et Industrialisation (</w:t>
       </w:r>
       <w:proofErr w:type="spellStart"/>
       <w:r>
-        <w:t>Industrialisation</w:t>
+        <w:rPr>
+          <w:sz w:val="25"/>
+          <w:lang w:val="fr-SN"/>
+        </w:rPr>
+        <w:t>Airflow</w:t>
       </w:r>
       <w:proofErr w:type="spellEnd"/>
       <w:r>
-        <w:t xml:space="preserve"> (Airflow)</w:t>
-      </w:r>
-    </w:p>
-    <w:p>
-      <w:r>
-        <w:t>9. Data Warehousing et NoSQL (Hive &amp; HBase)</w:t>
+        <w:rPr>
+          <w:sz w:val="25"/>
+          <w:lang w:val="fr-SN"/>
+        </w:rPr>
+        <w:t>)</w:t>
       </w:r>
     </w:p>
     <w:p>
       <w:pPr>
+        <w:spacing w:before="240" w:after="240" w:line="360" w:lineRule="auto"/>
         <w:rPr>
           <w:lang w:val="fr-SN"/>
         </w:rPr>
       </w:pPr>
       <w:r>
         <w:rPr>
+          <w:sz w:val="25"/>
+          <w:lang w:val="fr-SN"/>
+        </w:rPr>
+        <w:t xml:space="preserve">9. Data </w:t>
+      </w:r>
+      <w:proofErr w:type="spellStart"/>
+      <w:r>
+        <w:rPr>
+          <w:sz w:val="25"/>
+          <w:lang w:val="fr-SN"/>
+        </w:rPr>
+        <w:t>Warehousing</w:t>
+      </w:r>
+      <w:proofErr w:type="spellEnd"/>
+      <w:r>
+        <w:rPr>
+          <w:sz w:val="25"/>
+          <w:lang w:val="fr-SN"/>
+        </w:rPr>
+        <w:t xml:space="preserve"> et NoSQL (</w:t>
+      </w:r>
+      <w:proofErr w:type="spellStart"/>
+      <w:r>
+        <w:rPr>
+          <w:sz w:val="25"/>
+          <w:lang w:val="fr-SN"/>
+        </w:rPr>
+        <w:t>Hive</w:t>
+      </w:r>
+      <w:proofErr w:type="spellEnd"/>
+      <w:r>
+        <w:rPr>
+          <w:sz w:val="25"/>
+          <w:lang w:val="fr-SN"/>
+        </w:rPr>
+        <w:t xml:space="preserve"> &amp; HBase)</w:t>
+      </w:r>
+    </w:p>
+    <w:p>
+      <w:pPr>
+        <w:spacing w:before="240" w:after="240" w:line="360" w:lineRule="auto"/>
+        <w:rPr>
+          <w:lang w:val="fr-SN"/>
+        </w:rPr>
+      </w:pPr>
+      <w:r>
+        <w:rPr>
+          <w:sz w:val="25"/>
           <w:lang w:val="fr-SN"/>
         </w:rPr>
         <w:t>10. Visualisation et Business Intelligence</w:t>
@@ -272,12 +364,14 @@
     </w:p>
     <w:p>
       <w:pPr>
+        <w:spacing w:before="240" w:after="240" w:line="360" w:lineRule="auto"/>
         <w:rPr>
           <w:lang w:val="fr-SN"/>
         </w:rPr>
       </w:pPr>
       <w:r>
         <w:rPr>
+          <w:sz w:val="25"/>
           <w:lang w:val="fr-SN"/>
         </w:rPr>
         <w:t>11. Conclusion et Perspectives</w:t>
@@ -286,6 +380,7 @@
     <w:p>
       <w:pPr>
         <w:pStyle w:val="Titre1"/>
+        <w:spacing w:before="240" w:after="240" w:line="276" w:lineRule="auto"/>
         <w:rPr>
           <w:lang w:val="fr-SN"/>
         </w:rPr>
@@ -294,17 +389,21 @@
         <w:rPr>
           <w:lang w:val="fr-SN"/>
         </w:rPr>
+        <w:lastRenderedPageBreak/>
         <w:t xml:space="preserve">1. INTRODUCTION </w:t>
       </w:r>
     </w:p>
     <w:p>
       <w:pPr>
+        <w:spacing w:before="240" w:after="240" w:line="276" w:lineRule="auto"/>
+        <w:jc w:val="both"/>
         <w:rPr>
           <w:lang w:val="fr-SN"/>
         </w:rPr>
       </w:pPr>
       <w:r>
         <w:rPr>
+          <w:sz w:val="25"/>
           <w:lang w:val="fr-SN"/>
         </w:rPr>
         <w:t>Le projet Agri-Insight SN est une plateforme Big Data conçue pour transformer l'agriculture sénégalaise par l'analyse prédictive. Ce mémoire détaille l'implémentation technique d'un pipeline complet, de l'ingestion brute à la recommandation agronomique.</w:t>
@@ -313,6 +412,8 @@
     <w:p>
       <w:pPr>
         <w:pStyle w:val="Titre1"/>
+        <w:spacing w:before="240" w:after="240" w:line="276" w:lineRule="auto"/>
+        <w:jc w:val="both"/>
         <w:rPr>
           <w:lang w:val="fr-SN"/>
         </w:rPr>
@@ -326,12 +427,15 @@
     </w:p>
     <w:p>
       <w:pPr>
+        <w:spacing w:before="240" w:after="240"/>
+        <w:jc w:val="both"/>
         <w:rPr>
           <w:lang w:val="fr-SN"/>
         </w:rPr>
       </w:pPr>
       <w:r>
         <w:rPr>
+          <w:sz w:val="25"/>
           <w:lang w:val="fr-SN"/>
         </w:rPr>
         <w:t>L'objectif est de répondre aux défis de la sécurité alimentaire en fournissant des prévisions de rendement basées sur :</w:t>
@@ -339,12 +443,15 @@
     </w:p>
     <w:p>
       <w:pPr>
+        <w:spacing w:before="240" w:after="240"/>
+        <w:jc w:val="both"/>
         <w:rPr>
           <w:lang w:val="fr-SN"/>
         </w:rPr>
       </w:pPr>
       <w:r>
         <w:rPr>
+          <w:sz w:val="25"/>
           <w:lang w:val="fr-SN"/>
         </w:rPr>
         <w:t xml:space="preserve">   Les données climatiques (Pluviométrie, Température).</w:t>
@@ -352,12 +459,15 @@
     </w:p>
     <w:p>
       <w:pPr>
+        <w:spacing w:before="240" w:after="240"/>
+        <w:jc w:val="both"/>
         <w:rPr>
           <w:lang w:val="fr-SN"/>
         </w:rPr>
       </w:pPr>
       <w:r>
         <w:rPr>
+          <w:sz w:val="25"/>
           <w:lang w:val="fr-SN"/>
         </w:rPr>
         <w:t xml:space="preserve">   Les données pédologiques (pH du sol, nutriments).</w:t>
@@ -365,12 +475,15 @@
     </w:p>
     <w:p>
       <w:pPr>
+        <w:spacing w:before="240" w:after="240"/>
+        <w:jc w:val="both"/>
         <w:rPr>
           <w:lang w:val="fr-SN"/>
         </w:rPr>
       </w:pPr>
       <w:r>
         <w:rPr>
+          <w:sz w:val="25"/>
           <w:lang w:val="fr-SN"/>
         </w:rPr>
         <w:t xml:space="preserve">   L'analyse historique des cultures par région.</w:t>
@@ -379,6 +492,7 @@
     <w:p>
       <w:pPr>
         <w:pStyle w:val="Titre1"/>
+        <w:spacing w:before="240" w:after="240" w:line="276" w:lineRule="auto"/>
         <w:rPr>
           <w:lang w:val="fr-SN"/>
         </w:rPr>
@@ -393,6 +507,7 @@
     <w:p>
       <w:pPr>
         <w:pStyle w:val="Titre2"/>
+        <w:spacing w:before="240" w:after="240" w:line="276" w:lineRule="auto"/>
         <w:rPr>
           <w:lang w:val="fr-SN"/>
         </w:rPr>
@@ -406,12 +521,14 @@
     </w:p>
     <w:p>
       <w:pPr>
+        <w:spacing w:before="240" w:after="240" w:line="276" w:lineRule="auto"/>
         <w:rPr>
           <w:lang w:val="fr-SN"/>
         </w:rPr>
       </w:pPr>
       <w:r>
         <w:rPr>
+          <w:sz w:val="25"/>
           <w:lang w:val="fr-SN"/>
         </w:rPr>
         <w:t>L'architecture suit le pattern Lambda/Kappa simplifié, orchestré par Docker.</w:t>
@@ -420,16 +537,20 @@
     <w:tbl>
       <w:tblPr>
         <w:tblW w:w="0" w:type="auto"/>
+        <w:jc w:val="center"/>
+        <w:tblLayout w:type="fixed"/>
         <w:tblLook w:val="04A0" w:firstRow="1" w:lastRow="0" w:firstColumn="1" w:lastColumn="0" w:noHBand="0" w:noVBand="1"/>
       </w:tblPr>
       <w:tblGrid>
-        <w:gridCol w:w="5112"/>
-        <w:gridCol w:w="5112"/>
+        <w:gridCol w:w="18720"/>
       </w:tblGrid>
       <w:tr>
+        <w:trPr>
+          <w:jc w:val="center"/>
+        </w:trPr>
         <w:tc>
           <w:tcPr>
-            <w:tcW w:w="5112" w:type="dxa"/>
+            <w:tcW w:w="18720" w:type="dxa"/>
             <w:tcBorders>
               <w:top w:val="nil"/>
               <w:left w:val="nil"/>
@@ -439,41 +560,18 @@
           </w:tcPr>
           <w:p>
             <w:pPr>
-              <w:rPr>
-                <w:lang w:val="fr-SN"/>
-              </w:rPr>
-            </w:pPr>
-            <w:r>
-              <w:rPr>
-                <w:lang w:val="fr-SN"/>
-              </w:rPr>
-              <w:lastRenderedPageBreak/>
-              <w:t>Description technique de l'étape du pipeline Big Data ci-contre.</w:t>
-            </w:r>
-          </w:p>
-        </w:tc>
-        <w:tc>
-          <w:tcPr>
-            <w:tcW w:w="5112" w:type="dxa"/>
-            <w:tcBorders>
-              <w:top w:val="nil"/>
-              <w:left w:val="nil"/>
-              <w:bottom w:val="nil"/>
-              <w:right w:val="nil"/>
-            </w:tcBorders>
-          </w:tcPr>
-          <w:p>
-            <w:pPr>
+              <w:spacing w:line="276" w:lineRule="auto"/>
               <w:jc w:val="center"/>
             </w:pPr>
             <w:r>
               <w:rPr>
                 <w:noProof/>
+                <w:sz w:val="25"/>
               </w:rPr>
               <w:drawing>
-                <wp:inline distT="0" distB="0" distL="0" distR="0" wp14:anchorId="0DE6153B" wp14:editId="4EC936D9">
-                  <wp:extent cx="2926080" cy="2926080"/>
-                  <wp:effectExtent l="0" t="0" r="0" b="0"/>
+                <wp:inline distT="0" distB="0" distL="0" distR="0" wp14:anchorId="0DE6153B" wp14:editId="3EE26AB7">
+                  <wp:extent cx="5941695" cy="3737810"/>
+                  <wp:effectExtent l="0" t="0" r="1905" b="0"/>
                   <wp:docPr id="1" name="Picture 1"/>
                   <wp:cNvGraphicFramePr>
                     <a:graphicFrameLocks xmlns:a="http://schemas.openxmlformats.org/drawingml/2006/main" noChangeAspect="1"/>
@@ -494,7 +592,7 @@
                         <pic:spPr>
                           <a:xfrm>
                             <a:off x="0" y="0"/>
-                            <a:ext cx="2926080" cy="2926080"/>
+                            <a:ext cx="5974651" cy="3758542"/>
                           </a:xfrm>
                           <a:prstGeom prst="rect">
                             <a:avLst/>
@@ -509,15 +607,8 @@
           </w:p>
           <w:p>
             <w:pPr>
-              <w:jc w:val="center"/>
+              <w:spacing w:line="276" w:lineRule="auto"/>
             </w:pPr>
-            <w:r>
-              <w:rPr>
-                <w:i/>
-                <w:sz w:val="16"/>
-              </w:rPr>
-              <w:t>Architecture Pro Agri-Insight</w:t>
-            </w:r>
           </w:p>
         </w:tc>
       </w:tr>
@@ -525,19 +616,23 @@
     <w:p>
       <w:pPr>
         <w:pStyle w:val="Titre2"/>
+        <w:spacing w:before="240" w:after="240" w:line="276" w:lineRule="auto"/>
       </w:pPr>
       <w:r>
+        <w:lastRenderedPageBreak/>
         <w:t>3.2. Infrastructure as Code (IaC)</w:t>
       </w:r>
     </w:p>
     <w:p>
       <w:pPr>
+        <w:spacing w:before="240" w:after="240" w:line="276" w:lineRule="auto"/>
         <w:rPr>
           <w:lang w:val="fr-SN"/>
         </w:rPr>
       </w:pPr>
       <w:r>
         <w:rPr>
+          <w:sz w:val="25"/>
           <w:lang w:val="fr-SN"/>
         </w:rPr>
         <w:t xml:space="preserve">Le déploiement est automatisé via Docker Compose, permettant de lever un cluster complet (Hadoop, Spark, </w:t>
@@ -545,6 +640,7 @@
       <w:proofErr w:type="spellStart"/>
       <w:r>
         <w:rPr>
+          <w:sz w:val="25"/>
           <w:lang w:val="fr-SN"/>
         </w:rPr>
         <w:t>NiFi</w:t>
@@ -552,6 +648,7 @@
       <w:proofErr w:type="spellEnd"/>
       <w:r>
         <w:rPr>
+          <w:sz w:val="25"/>
           <w:lang w:val="fr-SN"/>
         </w:rPr>
         <w:t xml:space="preserve">, </w:t>
@@ -559,6 +656,7 @@
       <w:proofErr w:type="spellStart"/>
       <w:r>
         <w:rPr>
+          <w:sz w:val="25"/>
           <w:lang w:val="fr-SN"/>
         </w:rPr>
         <w:t>Airflow</w:t>
@@ -566,6 +664,7 @@
       <w:proofErr w:type="spellEnd"/>
       <w:r>
         <w:rPr>
+          <w:sz w:val="25"/>
           <w:lang w:val="fr-SN"/>
         </w:rPr>
         <w:t xml:space="preserve">, </w:t>
@@ -573,6 +672,7 @@
       <w:proofErr w:type="spellStart"/>
       <w:r>
         <w:rPr>
+          <w:sz w:val="25"/>
           <w:lang w:val="fr-SN"/>
         </w:rPr>
         <w:t>Hive</w:t>
@@ -580,24 +680,107 @@
       <w:proofErr w:type="spellEnd"/>
       <w:r>
         <w:rPr>
+          <w:sz w:val="25"/>
           <w:lang w:val="fr-SN"/>
         </w:rPr>
         <w:t>, HBase) en une seule commande.</w:t>
+      </w:r>
+    </w:p>
+    <w:p>
+      <w:pPr>
+        <w:pStyle w:val="Titre1"/>
+        <w:spacing w:before="240" w:after="240" w:line="276" w:lineRule="auto"/>
+        <w:rPr>
+          <w:lang w:val="fr-SN"/>
+        </w:rPr>
+      </w:pPr>
+      <w:r>
+        <w:rPr>
+          <w:lang w:val="fr-SN"/>
+        </w:rPr>
+        <w:t xml:space="preserve">4. INGESTION ET FLUX DE DONNÉES (NIFI) </w:t>
+      </w:r>
+    </w:p>
+    <w:p>
+      <w:pPr>
+        <w:spacing w:before="240" w:after="240" w:line="276" w:lineRule="auto"/>
+        <w:rPr>
+          <w:lang w:val="fr-SN"/>
+        </w:rPr>
+      </w:pPr>
+      <w:r>
+        <w:rPr>
+          <w:sz w:val="25"/>
+          <w:lang w:val="fr-SN"/>
+        </w:rPr>
+        <w:t xml:space="preserve">Apache </w:t>
+      </w:r>
+      <w:proofErr w:type="spellStart"/>
+      <w:r>
+        <w:rPr>
+          <w:sz w:val="25"/>
+          <w:lang w:val="fr-SN"/>
+        </w:rPr>
+        <w:t>NiFi</w:t>
+      </w:r>
+      <w:proofErr w:type="spellEnd"/>
+      <w:r>
+        <w:rPr>
+          <w:sz w:val="25"/>
+          <w:lang w:val="fr-SN"/>
+        </w:rPr>
+        <w:t xml:space="preserve"> assure la collecte des données sources. Nous avons </w:t>
+      </w:r>
+      <w:proofErr w:type="gramStart"/>
+      <w:r>
+        <w:rPr>
+          <w:sz w:val="25"/>
+          <w:lang w:val="fr-SN"/>
+        </w:rPr>
+        <w:t>implémente</w:t>
+      </w:r>
+      <w:proofErr w:type="gramEnd"/>
+      <w:r>
+        <w:rPr>
+          <w:sz w:val="25"/>
+          <w:lang w:val="fr-SN"/>
+        </w:rPr>
+        <w:t xml:space="preserve"> des </w:t>
+      </w:r>
+      <w:proofErr w:type="spellStart"/>
+      <w:r>
+        <w:rPr>
+          <w:sz w:val="25"/>
+          <w:lang w:val="fr-SN"/>
+        </w:rPr>
+        <w:t>templates</w:t>
+      </w:r>
+      <w:proofErr w:type="spellEnd"/>
+      <w:r>
+        <w:rPr>
+          <w:sz w:val="25"/>
+          <w:lang w:val="fr-SN"/>
+        </w:rPr>
+        <w:t xml:space="preserve"> réutilisables pour l'ingestion vers HDFS.</w:t>
       </w:r>
     </w:p>
     <w:tbl>
       <w:tblPr>
         <w:tblW w:w="0" w:type="auto"/>
+        <w:jc w:val="center"/>
+        <w:tblLayout w:type="fixed"/>
         <w:tblLook w:val="04A0" w:firstRow="1" w:lastRow="0" w:firstColumn="1" w:lastColumn="0" w:noHBand="0" w:noVBand="1"/>
       </w:tblPr>
       <w:tblGrid>
-        <w:gridCol w:w="5112"/>
-        <w:gridCol w:w="5112"/>
+        <w:gridCol w:w="18720"/>
       </w:tblGrid>
       <w:tr>
+        <w:trPr>
+          <w:jc w:val="center"/>
+        </w:trPr>
         <w:tc>
           <w:tcPr>
-            <w:tcW w:w="5112" w:type="dxa"/>
+            <w:tcW w:w="18720" w:type="dxa"/>
             <w:tcBorders>
               <w:top w:val="nil"/>
               <w:left w:val="nil"/>
@@ -607,41 +790,19 @@
           </w:tcPr>
           <w:p>
             <w:pPr>
-              <w:rPr>
-                <w:lang w:val="fr-SN"/>
-              </w:rPr>
-            </w:pPr>
-            <w:r>
-              <w:rPr>
-                <w:lang w:val="fr-SN"/>
-              </w:rPr>
-              <w:t>Description technique de l'étape du pipeline Big Data ci-contre.</w:t>
-            </w:r>
-          </w:p>
-        </w:tc>
-        <w:tc>
-          <w:tcPr>
-            <w:tcW w:w="5112" w:type="dxa"/>
-            <w:tcBorders>
-              <w:top w:val="nil"/>
-              <w:left w:val="nil"/>
-              <w:bottom w:val="nil"/>
-              <w:right w:val="nil"/>
-            </w:tcBorders>
-          </w:tcPr>
-          <w:p>
-            <w:pPr>
+              <w:spacing w:line="276" w:lineRule="auto"/>
               <w:jc w:val="center"/>
             </w:pPr>
             <w:r>
               <w:rPr>
                 <w:noProof/>
+                <w:sz w:val="25"/>
               </w:rPr>
               <w:drawing>
-                <wp:inline distT="0" distB="0" distL="0" distR="0" wp14:anchorId="184A0870" wp14:editId="6B326FDA">
-                  <wp:extent cx="2926080" cy="3224414"/>
-                  <wp:effectExtent l="0" t="0" r="0" b="0"/>
-                  <wp:docPr id="2" name="Picture 2"/>
+                <wp:inline distT="0" distB="0" distL="0" distR="0" wp14:anchorId="08F9DCC2" wp14:editId="6DE79149">
+                  <wp:extent cx="5941798" cy="3529264"/>
+                  <wp:effectExtent l="0" t="0" r="1905" b="0"/>
+                  <wp:docPr id="3" name="Picture 3"/>
                   <wp:cNvGraphicFramePr>
                     <a:graphicFrameLocks xmlns:a="http://schemas.openxmlformats.org/drawingml/2006/main" noChangeAspect="1"/>
                   </wp:cNvGraphicFramePr>
@@ -649,7 +810,7 @@
                     <a:graphicData uri="http://schemas.openxmlformats.org/drawingml/2006/picture">
                       <pic:pic xmlns:pic="http://schemas.openxmlformats.org/drawingml/2006/picture">
                         <pic:nvPicPr>
-                          <pic:cNvPr id="0" name="vscode_docker_compose.png"/>
+                          <pic:cNvPr id="0" name="nifi_ui.png"/>
                           <pic:cNvPicPr/>
                         </pic:nvPicPr>
                         <pic:blipFill>
@@ -661,7 +822,189 @@
                         <pic:spPr>
                           <a:xfrm>
                             <a:off x="0" y="0"/>
-                            <a:ext cx="2926080" cy="3224414"/>
+                            <a:ext cx="5961526" cy="3540982"/>
+                          </a:xfrm>
+                          <a:prstGeom prst="rect">
+                            <a:avLst/>
+                          </a:prstGeom>
+                        </pic:spPr>
+                      </pic:pic>
+                    </a:graphicData>
+                  </a:graphic>
+                </wp:inline>
+              </w:drawing>
+            </w:r>
+          </w:p>
+        </w:tc>
+      </w:tr>
+    </w:tbl>
+    <w:p>
+      <w:pPr>
+        <w:spacing w:before="240" w:after="240" w:line="276" w:lineRule="auto"/>
+        <w:rPr>
+          <w:lang w:val="fr-SN"/>
+        </w:rPr>
+      </w:pPr>
+      <w:r>
+        <w:rPr>
+          <w:sz w:val="25"/>
+          <w:lang w:val="fr-SN"/>
+        </w:rPr>
+        <w:t xml:space="preserve">Figure 2 : Interface de pilotage Apache </w:t>
+      </w:r>
+      <w:proofErr w:type="spellStart"/>
+      <w:r>
+        <w:rPr>
+          <w:sz w:val="25"/>
+          <w:lang w:val="fr-SN"/>
+        </w:rPr>
+        <w:t>NiFi</w:t>
+      </w:r>
+      <w:proofErr w:type="spellEnd"/>
+      <w:r>
+        <w:rPr>
+          <w:sz w:val="25"/>
+          <w:lang w:val="fr-SN"/>
+        </w:rPr>
+        <w:t xml:space="preserve"> gérant les flux d'entrée.</w:t>
+      </w:r>
+    </w:p>
+    <w:p>
+      <w:pPr>
+        <w:pStyle w:val="Titre1"/>
+        <w:spacing w:before="240" w:after="240" w:line="276" w:lineRule="auto"/>
+        <w:rPr>
+          <w:lang w:val="fr-SN"/>
+        </w:rPr>
+      </w:pPr>
+      <w:r>
+        <w:rPr>
+          <w:lang w:val="fr-SN"/>
+        </w:rPr>
+        <w:t xml:space="preserve">5. STOCKAGE ET ARCHITECTURE MÉDAILLON (HDFS) </w:t>
+      </w:r>
+    </w:p>
+    <w:p>
+      <w:pPr>
+        <w:spacing w:before="240" w:after="240" w:line="276" w:lineRule="auto"/>
+        <w:rPr>
+          <w:lang w:val="fr-SN"/>
+        </w:rPr>
+      </w:pPr>
+      <w:r>
+        <w:rPr>
+          <w:sz w:val="25"/>
+          <w:lang w:val="fr-SN"/>
+        </w:rPr>
+        <w:t>Nous utilisons une architecture de données en "Médaillon" pour garantir la qualité.</w:t>
+      </w:r>
+    </w:p>
+    <w:p>
+      <w:pPr>
+        <w:pStyle w:val="Titre2"/>
+        <w:spacing w:before="240" w:after="240" w:line="276" w:lineRule="auto"/>
+        <w:rPr>
+          <w:lang w:val="fr-SN"/>
+        </w:rPr>
+      </w:pPr>
+      <w:r>
+        <w:rPr>
+          <w:lang w:val="fr-SN"/>
+        </w:rPr>
+        <w:t>5.1. Couche Bronze (Données Brutes)</w:t>
+      </w:r>
+    </w:p>
+    <w:p>
+      <w:pPr>
+        <w:spacing w:before="240" w:after="240" w:line="276" w:lineRule="auto"/>
+        <w:rPr>
+          <w:lang w:val="fr-SN"/>
+        </w:rPr>
+      </w:pPr>
+      <w:r>
+        <w:rPr>
+          <w:sz w:val="25"/>
+          <w:lang w:val="fr-SN"/>
+        </w:rPr>
+        <w:t>Les fichiers CSV entrants sont stockés sans modification pour garantir l'</w:t>
+      </w:r>
+      <w:proofErr w:type="spellStart"/>
+      <w:r>
+        <w:rPr>
+          <w:sz w:val="25"/>
+          <w:lang w:val="fr-SN"/>
+        </w:rPr>
+        <w:t>auditabilité</w:t>
+      </w:r>
+      <w:proofErr w:type="spellEnd"/>
+      <w:r>
+        <w:rPr>
+          <w:sz w:val="25"/>
+          <w:lang w:val="fr-SN"/>
+        </w:rPr>
+        <w:t>.</w:t>
+      </w:r>
+    </w:p>
+    <w:tbl>
+      <w:tblPr>
+        <w:tblW w:w="0" w:type="auto"/>
+        <w:jc w:val="center"/>
+        <w:tblLayout w:type="fixed"/>
+        <w:tblLook w:val="04A0" w:firstRow="1" w:lastRow="0" w:firstColumn="1" w:lastColumn="0" w:noHBand="0" w:noVBand="1"/>
+      </w:tblPr>
+      <w:tblGrid>
+        <w:gridCol w:w="18720"/>
+      </w:tblGrid>
+      <w:tr>
+        <w:trPr>
+          <w:jc w:val="center"/>
+        </w:trPr>
+        <w:tc>
+          <w:tcPr>
+            <w:tcW w:w="18720" w:type="dxa"/>
+            <w:tcBorders>
+              <w:top w:val="nil"/>
+              <w:left w:val="nil"/>
+              <w:bottom w:val="nil"/>
+              <w:right w:val="nil"/>
+            </w:tcBorders>
+          </w:tcPr>
+          <w:p>
+            <w:pPr>
+              <w:spacing w:line="276" w:lineRule="auto"/>
+              <w:jc w:val="center"/>
+            </w:pPr>
+            <w:r>
+              <w:rPr>
+                <w:noProof/>
+                <w:sz w:val="25"/>
+              </w:rPr>
+              <w:lastRenderedPageBreak/>
+              <w:drawing>
+                <wp:inline distT="0" distB="0" distL="0" distR="0" wp14:anchorId="55EDE113" wp14:editId="66FC002F">
+                  <wp:extent cx="5942213" cy="2671011"/>
+                  <wp:effectExtent l="0" t="0" r="1905" b="0"/>
+                  <wp:docPr id="6" name="Picture 6"/>
+                  <wp:cNvGraphicFramePr>
+                    <a:graphicFrameLocks xmlns:a="http://schemas.openxmlformats.org/drawingml/2006/main" noChangeAspect="1"/>
+                  </wp:cNvGraphicFramePr>
+                  <a:graphic xmlns:a="http://schemas.openxmlformats.org/drawingml/2006/main">
+                    <a:graphicData uri="http://schemas.openxmlformats.org/drawingml/2006/picture">
+                      <pic:pic xmlns:pic="http://schemas.openxmlformats.org/drawingml/2006/picture">
+                        <pic:nvPicPr>
+                          <pic:cNvPr id="0" name="hdfs_bronze.png"/>
+                          <pic:cNvPicPr/>
+                        </pic:nvPicPr>
+                        <pic:blipFill>
+                          <a:blip r:embed="rId8"/>
+                          <a:stretch>
+                            <a:fillRect/>
+                          </a:stretch>
+                        </pic:blipFill>
+                        <pic:spPr>
+                          <a:xfrm>
+                            <a:off x="0" y="0"/>
+                            <a:ext cx="5962196" cy="2679993"/>
                           </a:xfrm>
                           <a:prstGeom prst="rect">
                             <a:avLst/>
@@ -676,128 +1019,93 @@
           </w:p>
           <w:p>
             <w:pPr>
-              <w:jc w:val="center"/>
+              <w:spacing w:line="276" w:lineRule="auto"/>
             </w:pPr>
-            <w:r>
-              <w:rPr>
-                <w:i/>
-                <w:sz w:val="16"/>
-              </w:rPr>
-              <w:t>Configuration Docker Compose</w:t>
-            </w:r>
           </w:p>
         </w:tc>
       </w:tr>
     </w:tbl>
     <w:p>
       <w:pPr>
+        <w:spacing w:before="240" w:after="240" w:line="276" w:lineRule="auto"/>
         <w:rPr>
           <w:lang w:val="fr-SN"/>
         </w:rPr>
       </w:pPr>
       <w:r>
         <w:rPr>
-          <w:lang w:val="fr-SN"/>
-        </w:rPr>
-        <w:t>Figure 1 : Extrait du fichier docker-</w:t>
+          <w:sz w:val="25"/>
+          <w:lang w:val="fr-SN"/>
+        </w:rPr>
+        <w:t>Figure 5 : Exploration du HDFS montrant les données brutes dans /</w:t>
       </w:r>
       <w:proofErr w:type="spellStart"/>
       <w:r>
         <w:rPr>
-          <w:lang w:val="fr-SN"/>
-        </w:rPr>
-        <w:t>compose.yml</w:t>
+          <w:sz w:val="25"/>
+          <w:lang w:val="fr-SN"/>
+        </w:rPr>
+        <w:t>agriinsight</w:t>
       </w:r>
       <w:proofErr w:type="spellEnd"/>
       <w:r>
         <w:rPr>
-          <w:lang w:val="fr-SN"/>
-        </w:rPr>
-        <w:t xml:space="preserve"> définissant les services du cluster.</w:t>
+          <w:sz w:val="25"/>
+          <w:lang w:val="fr-SN"/>
+        </w:rPr>
+        <w:t>/</w:t>
+      </w:r>
+      <w:proofErr w:type="gramStart"/>
+      <w:r>
+        <w:rPr>
+          <w:sz w:val="25"/>
+          <w:lang w:val="fr-SN"/>
+        </w:rPr>
+        <w:t>bronze.*</w:t>
+      </w:r>
+      <w:proofErr w:type="gramEnd"/>
+    </w:p>
+    <w:p>
+      <w:pPr>
+        <w:pStyle w:val="Titre1"/>
+        <w:spacing w:before="240" w:after="240" w:line="276" w:lineRule="auto"/>
+      </w:pPr>
+      <w:r>
+        <w:t xml:space="preserve">6. TRAITEMENT ET FEATURE ENGINEERING (SPARK) </w:t>
       </w:r>
     </w:p>
     <w:p>
       <w:pPr>
-        <w:pStyle w:val="Titre1"/>
+        <w:spacing w:before="240" w:after="240" w:line="276" w:lineRule="auto"/>
         <w:rPr>
           <w:lang w:val="fr-SN"/>
         </w:rPr>
       </w:pPr>
       <w:r>
         <w:rPr>
-          <w:lang w:val="fr-SN"/>
-        </w:rPr>
-        <w:t xml:space="preserve">4. INGESTION ET FLUX DE DONNÉES (NIFI) </w:t>
-      </w:r>
-    </w:p>
-    <w:p>
-      <w:pPr>
-        <w:rPr>
-          <w:lang w:val="fr-SN"/>
-        </w:rPr>
-      </w:pPr>
-      <w:r>
-        <w:rPr>
-          <w:lang w:val="fr-SN"/>
-        </w:rPr>
-        <w:t xml:space="preserve">Apache </w:t>
-      </w:r>
-      <w:proofErr w:type="spellStart"/>
-      <w:r>
-        <w:rPr>
-          <w:lang w:val="fr-SN"/>
-        </w:rPr>
-        <w:t>NiFi</w:t>
-      </w:r>
-      <w:proofErr w:type="spellEnd"/>
-      <w:r>
-        <w:rPr>
-          <w:lang w:val="fr-SN"/>
-        </w:rPr>
-        <w:t xml:space="preserve"> assure la collecte des données sources. Nous avons </w:t>
-      </w:r>
-      <w:proofErr w:type="gramStart"/>
-      <w:r>
-        <w:rPr>
-          <w:lang w:val="fr-SN"/>
-        </w:rPr>
-        <w:t>implémente</w:t>
-      </w:r>
-      <w:proofErr w:type="gramEnd"/>
-      <w:r>
-        <w:rPr>
-          <w:lang w:val="fr-SN"/>
-        </w:rPr>
-        <w:t xml:space="preserve"> des </w:t>
-      </w:r>
-      <w:proofErr w:type="spellStart"/>
-      <w:r>
-        <w:rPr>
-          <w:lang w:val="fr-SN"/>
-        </w:rPr>
-        <w:t>templates</w:t>
-      </w:r>
-      <w:proofErr w:type="spellEnd"/>
-      <w:r>
-        <w:rPr>
-          <w:lang w:val="fr-SN"/>
-        </w:rPr>
-        <w:t xml:space="preserve"> réutilisables pour l'ingestion vers HDFS.</w:t>
+          <w:sz w:val="25"/>
+          <w:lang w:val="fr-SN"/>
+        </w:rPr>
+        <w:t>Apache Spark est le moteur de calcul principal. Il transforme les données Bronze en données Silver (nettoyées et enrichies).</w:t>
       </w:r>
     </w:p>
     <w:tbl>
       <w:tblPr>
         <w:tblW w:w="0" w:type="auto"/>
+        <w:jc w:val="center"/>
+        <w:tblLayout w:type="fixed"/>
         <w:tblLook w:val="04A0" w:firstRow="1" w:lastRow="0" w:firstColumn="1" w:lastColumn="0" w:noHBand="0" w:noVBand="1"/>
       </w:tblPr>
       <w:tblGrid>
-        <w:gridCol w:w="5112"/>
-        <w:gridCol w:w="5112"/>
+        <w:gridCol w:w="18720"/>
       </w:tblGrid>
       <w:tr>
+        <w:trPr>
+          <w:jc w:val="center"/>
+        </w:trPr>
         <w:tc>
           <w:tcPr>
-            <w:tcW w:w="5112" w:type="dxa"/>
+            <w:tcW w:w="18720" w:type="dxa"/>
             <w:tcBorders>
               <w:top w:val="nil"/>
               <w:left w:val="nil"/>
@@ -807,42 +1115,19 @@
           </w:tcPr>
           <w:p>
             <w:pPr>
-              <w:rPr>
-                <w:lang w:val="fr-SN"/>
-              </w:rPr>
-            </w:pPr>
-            <w:r>
-              <w:rPr>
-                <w:lang w:val="fr-SN"/>
-              </w:rPr>
-              <w:lastRenderedPageBreak/>
-              <w:t>Description technique de l'étape du pipeline Big Data ci-contre.</w:t>
-            </w:r>
-          </w:p>
-        </w:tc>
-        <w:tc>
-          <w:tcPr>
-            <w:tcW w:w="5112" w:type="dxa"/>
-            <w:tcBorders>
-              <w:top w:val="nil"/>
-              <w:left w:val="nil"/>
-              <w:bottom w:val="nil"/>
-              <w:right w:val="nil"/>
-            </w:tcBorders>
-          </w:tcPr>
-          <w:p>
-            <w:pPr>
+              <w:spacing w:line="276" w:lineRule="auto"/>
               <w:jc w:val="center"/>
             </w:pPr>
             <w:r>
               <w:rPr>
                 <w:noProof/>
+                <w:sz w:val="25"/>
               </w:rPr>
               <w:drawing>
-                <wp:inline distT="0" distB="0" distL="0" distR="0" wp14:anchorId="08F9DCC2" wp14:editId="7496BAF1">
-                  <wp:extent cx="2926080" cy="2018642"/>
-                  <wp:effectExtent l="0" t="0" r="0" b="0"/>
-                  <wp:docPr id="3" name="Picture 3"/>
+                <wp:inline distT="0" distB="0" distL="0" distR="0" wp14:anchorId="606C80EC" wp14:editId="46A94A4A">
+                  <wp:extent cx="5941225" cy="3481137"/>
+                  <wp:effectExtent l="0" t="0" r="2540" b="5080"/>
+                  <wp:docPr id="8" name="Picture 8"/>
                   <wp:cNvGraphicFramePr>
                     <a:graphicFrameLocks xmlns:a="http://schemas.openxmlformats.org/drawingml/2006/main" noChangeAspect="1"/>
                   </wp:cNvGraphicFramePr>
@@ -850,11 +1135,11 @@
                     <a:graphicData uri="http://schemas.openxmlformats.org/drawingml/2006/picture">
                       <pic:pic xmlns:pic="http://schemas.openxmlformats.org/drawingml/2006/picture">
                         <pic:nvPicPr>
-                          <pic:cNvPr id="0" name="nifi_ui.png"/>
+                          <pic:cNvPr id="0" name="spark_worker.png"/>
                           <pic:cNvPicPr/>
                         </pic:nvPicPr>
                         <pic:blipFill>
-                          <a:blip r:embed="rId8"/>
+                          <a:blip r:embed="rId9"/>
                           <a:stretch>
                             <a:fillRect/>
                           </a:stretch>
@@ -862,7 +1147,7 @@
                         <pic:spPr>
                           <a:xfrm>
                             <a:off x="0" y="0"/>
-                            <a:ext cx="2926080" cy="2018642"/>
+                            <a:ext cx="5968121" cy="3496896"/>
                           </a:xfrm>
                           <a:prstGeom prst="rect">
                             <a:avLst/>
@@ -877,59 +1162,193 @@
           </w:p>
           <w:p>
             <w:pPr>
-              <w:jc w:val="center"/>
+              <w:spacing w:line="276" w:lineRule="auto"/>
             </w:pPr>
-            <w:r>
-              <w:rPr>
-                <w:i/>
-                <w:sz w:val="16"/>
-              </w:rPr>
-              <w:t>Interface NiFi</w:t>
-            </w:r>
           </w:p>
         </w:tc>
       </w:tr>
     </w:tbl>
     <w:p>
       <w:pPr>
+        <w:spacing w:before="240" w:after="240" w:line="276" w:lineRule="auto"/>
         <w:rPr>
           <w:lang w:val="fr-SN"/>
         </w:rPr>
       </w:pPr>
       <w:r>
         <w:rPr>
-          <w:lang w:val="fr-SN"/>
-        </w:rPr>
-        <w:t xml:space="preserve">Figure 2 : Interface de pilotage Apache </w:t>
+          <w:sz w:val="25"/>
+          <w:lang w:val="fr-SN"/>
+        </w:rPr>
+        <w:lastRenderedPageBreak/>
+        <w:t xml:space="preserve">Figure 7 : Détails d'un </w:t>
       </w:r>
       <w:proofErr w:type="spellStart"/>
       <w:r>
         <w:rPr>
-          <w:lang w:val="fr-SN"/>
-        </w:rPr>
-        <w:t>NiFi</w:t>
+          <w:sz w:val="25"/>
+          <w:lang w:val="fr-SN"/>
+        </w:rPr>
+        <w:t>Worker</w:t>
       </w:r>
       <w:proofErr w:type="spellEnd"/>
       <w:r>
         <w:rPr>
-          <w:lang w:val="fr-SN"/>
-        </w:rPr>
-        <w:t xml:space="preserve"> gérant les flux d'entrée.</w:t>
+          <w:sz w:val="25"/>
+          <w:lang w:val="fr-SN"/>
+        </w:rPr>
+        <w:t xml:space="preserve"> Spark (Cœurs et Mémoire utilisés).</w:t>
+      </w:r>
+    </w:p>
+    <w:p>
+      <w:pPr>
+        <w:pStyle w:val="Titre1"/>
+        <w:spacing w:before="240" w:after="240" w:line="276" w:lineRule="auto"/>
+      </w:pPr>
+      <w:r>
+        <w:t xml:space="preserve">7. MACHINE LEARNING ET MLOPS (SPARK MLLIB) </w:t>
+      </w:r>
+    </w:p>
+    <w:p>
+      <w:pPr>
+        <w:spacing w:before="240" w:after="240" w:line="276" w:lineRule="auto"/>
+        <w:rPr>
+          <w:lang w:val="fr-SN"/>
+        </w:rPr>
+      </w:pPr>
+      <w:r>
+        <w:rPr>
+          <w:sz w:val="25"/>
+          <w:lang w:val="fr-SN"/>
+        </w:rPr>
+        <w:t xml:space="preserve">Nous entraînons un modèle </w:t>
+      </w:r>
+      <w:proofErr w:type="spellStart"/>
+      <w:r>
+        <w:rPr>
+          <w:sz w:val="25"/>
+          <w:lang w:val="fr-SN"/>
+        </w:rPr>
+        <w:t>Random</w:t>
+      </w:r>
+      <w:proofErr w:type="spellEnd"/>
+      <w:r>
+        <w:rPr>
+          <w:sz w:val="25"/>
+          <w:lang w:val="fr-SN"/>
+        </w:rPr>
+        <w:t xml:space="preserve"> Forest </w:t>
+      </w:r>
+      <w:proofErr w:type="spellStart"/>
+      <w:r>
+        <w:rPr>
+          <w:sz w:val="25"/>
+          <w:lang w:val="fr-SN"/>
+        </w:rPr>
+        <w:t>Regressor</w:t>
+      </w:r>
+      <w:proofErr w:type="spellEnd"/>
+      <w:r>
+        <w:rPr>
+          <w:sz w:val="25"/>
+          <w:lang w:val="fr-SN"/>
+        </w:rPr>
+        <w:t xml:space="preserve"> pour prédire les rendements.</w:t>
+      </w:r>
+    </w:p>
+    <w:p>
+      <w:pPr>
+        <w:pStyle w:val="Titre2"/>
+        <w:spacing w:before="240" w:after="240" w:line="276" w:lineRule="auto"/>
+        <w:rPr>
+          <w:lang w:val="fr-SN"/>
+        </w:rPr>
+      </w:pPr>
+      <w:r>
+        <w:rPr>
+          <w:lang w:val="fr-SN"/>
+        </w:rPr>
+        <w:t>7.1. Persistance des Modèles</w:t>
+      </w:r>
+    </w:p>
+    <w:p>
+      <w:pPr>
+        <w:spacing w:before="240" w:after="240" w:line="276" w:lineRule="auto"/>
+        <w:rPr>
+          <w:lang w:val="fr-SN"/>
+        </w:rPr>
+      </w:pPr>
+      <w:r>
+        <w:rPr>
+          <w:sz w:val="25"/>
+          <w:lang w:val="fr-SN"/>
+        </w:rPr>
+        <w:t>Le modèle entraîné est stocké sur HDFS avec ses différentes étapes de transformation.</w:t>
+      </w:r>
+    </w:p>
+    <w:p>
+      <w:pPr>
+        <w:pStyle w:val="Titre1"/>
+        <w:spacing w:before="240" w:after="240" w:line="276" w:lineRule="auto"/>
+        <w:rPr>
+          <w:lang w:val="fr-SN"/>
+        </w:rPr>
+      </w:pPr>
+      <w:r>
+        <w:rPr>
+          <w:lang w:val="fr-SN"/>
+        </w:rPr>
+        <w:t xml:space="preserve">8. ORCHESTRATION ET INDUSTRIALISATION (AIRFLOW) </w:t>
+      </w:r>
+    </w:p>
+    <w:p>
+      <w:pPr>
+        <w:spacing w:before="240" w:after="240" w:line="276" w:lineRule="auto"/>
+        <w:rPr>
+          <w:lang w:val="fr-SN"/>
+        </w:rPr>
+      </w:pPr>
+      <w:r>
+        <w:rPr>
+          <w:sz w:val="25"/>
+          <w:lang w:val="fr-SN"/>
+        </w:rPr>
+        <w:t xml:space="preserve">Apache </w:t>
+      </w:r>
+      <w:proofErr w:type="spellStart"/>
+      <w:r>
+        <w:rPr>
+          <w:sz w:val="25"/>
+          <w:lang w:val="fr-SN"/>
+        </w:rPr>
+        <w:t>Airflow</w:t>
+      </w:r>
+      <w:proofErr w:type="spellEnd"/>
+      <w:r>
+        <w:rPr>
+          <w:sz w:val="25"/>
+          <w:lang w:val="fr-SN"/>
+        </w:rPr>
+        <w:t xml:space="preserve"> orchestre l'ensemble du pipeline. Il permet de gérer les dépendances entre les tâches et d'automatiser le réentraînement des modèles.</w:t>
       </w:r>
     </w:p>
     <w:tbl>
       <w:tblPr>
         <w:tblW w:w="0" w:type="auto"/>
+        <w:jc w:val="center"/>
+        <w:tblLayout w:type="fixed"/>
         <w:tblLook w:val="04A0" w:firstRow="1" w:lastRow="0" w:firstColumn="1" w:lastColumn="0" w:noHBand="0" w:noVBand="1"/>
       </w:tblPr>
       <w:tblGrid>
-        <w:gridCol w:w="5112"/>
-        <w:gridCol w:w="5112"/>
+        <w:gridCol w:w="18720"/>
       </w:tblGrid>
       <w:tr>
+        <w:trPr>
+          <w:jc w:val="center"/>
+        </w:trPr>
         <w:tc>
           <w:tcPr>
-            <w:tcW w:w="5112" w:type="dxa"/>
+            <w:tcW w:w="18720" w:type="dxa"/>
             <w:tcBorders>
               <w:top w:val="nil"/>
               <w:left w:val="nil"/>
@@ -939,21 +1358,185 @@
           </w:tcPr>
           <w:p>
             <w:pPr>
+              <w:spacing w:line="276" w:lineRule="auto"/>
+              <w:jc w:val="center"/>
               <w:rPr>
                 <w:lang w:val="fr-SN"/>
               </w:rPr>
             </w:pPr>
             <w:r>
               <w:rPr>
+                <w:sz w:val="25"/>
                 <w:lang w:val="fr-SN"/>
               </w:rPr>
               <w:t>Description technique de l'étape du pipeline Big Data ci-contre.</w:t>
             </w:r>
           </w:p>
+          <w:p>
+            <w:pPr>
+              <w:spacing w:line="276" w:lineRule="auto"/>
+              <w:jc w:val="center"/>
+            </w:pPr>
+            <w:r>
+              <w:rPr>
+                <w:noProof/>
+                <w:sz w:val="25"/>
+              </w:rPr>
+              <w:drawing>
+                <wp:inline distT="0" distB="0" distL="0" distR="0" wp14:anchorId="698E980E" wp14:editId="671AF390">
+                  <wp:extent cx="6084000" cy="3472021"/>
+                  <wp:effectExtent l="0" t="0" r="0" b="0"/>
+                  <wp:docPr id="19" name="Image 19"/>
+                  <wp:cNvGraphicFramePr>
+                    <a:graphicFrameLocks xmlns:a="http://schemas.openxmlformats.org/drawingml/2006/main" noChangeAspect="1"/>
+                  </wp:cNvGraphicFramePr>
+                  <a:graphic xmlns:a="http://schemas.openxmlformats.org/drawingml/2006/main">
+                    <a:graphicData uri="http://schemas.openxmlformats.org/drawingml/2006/picture">
+                      <pic:pic xmlns:pic="http://schemas.openxmlformats.org/drawingml/2006/picture">
+                        <pic:nvPicPr>
+                          <pic:cNvPr id="0" name="Picture 4"/>
+                          <pic:cNvPicPr>
+                            <a:picLocks noChangeAspect="1" noChangeArrowheads="1"/>
+                          </pic:cNvPicPr>
+                        </pic:nvPicPr>
+                        <pic:blipFill>
+                          <a:blip r:embed="rId10">
+                            <a:extLst>
+                              <a:ext uri="{28A0092B-C50C-407E-A947-70E740481C1C}">
+                                <a14:useLocalDpi xmlns:a14="http://schemas.microsoft.com/office/drawing/2010/main" val="0"/>
+                              </a:ext>
+                            </a:extLst>
+                          </a:blip>
+                          <a:srcRect/>
+                          <a:stretch>
+                            <a:fillRect/>
+                          </a:stretch>
+                        </pic:blipFill>
+                        <pic:spPr bwMode="auto">
+                          <a:xfrm>
+                            <a:off x="0" y="0"/>
+                            <a:ext cx="6084000" cy="3472021"/>
+                          </a:xfrm>
+                          <a:prstGeom prst="rect">
+                            <a:avLst/>
+                          </a:prstGeom>
+                          <a:noFill/>
+                          <a:ln>
+                            <a:noFill/>
+                          </a:ln>
+                        </pic:spPr>
+                      </pic:pic>
+                    </a:graphicData>
+                  </a:graphic>
+                </wp:inline>
+              </w:drawing>
+            </w:r>
+          </w:p>
+          <w:p>
+            <w:pPr>
+              <w:spacing w:line="276" w:lineRule="auto"/>
+              <w:jc w:val="center"/>
+            </w:pPr>
+            <w:r>
+              <w:rPr>
+                <w:i/>
+                <w:sz w:val="25"/>
+              </w:rPr>
+              <w:t>Liste des DAGs Airflow</w:t>
+            </w:r>
+          </w:p>
         </w:tc>
+      </w:tr>
+    </w:tbl>
+    <w:p>
+      <w:pPr>
+        <w:spacing w:before="240" w:after="240" w:line="276" w:lineRule="auto"/>
+        <w:rPr>
+          <w:lang w:val="fr-SN"/>
+        </w:rPr>
+      </w:pPr>
+      <w:r>
+        <w:rPr>
+          <w:sz w:val="25"/>
+          <w:lang w:val="fr-SN"/>
+        </w:rPr>
+        <w:t>Figure 9 : Liste des Workflows (</w:t>
+      </w:r>
+      <w:proofErr w:type="spellStart"/>
+      <w:r>
+        <w:rPr>
+          <w:sz w:val="25"/>
+          <w:lang w:val="fr-SN"/>
+        </w:rPr>
+        <w:t>DAGs</w:t>
+      </w:r>
+      <w:proofErr w:type="spellEnd"/>
+      <w:r>
+        <w:rPr>
+          <w:sz w:val="25"/>
+          <w:lang w:val="fr-SN"/>
+        </w:rPr>
+        <w:t>) actifs dans l'orchestrateur.</w:t>
+      </w:r>
+    </w:p>
+    <w:p>
+      <w:pPr>
+        <w:pStyle w:val="Titre1"/>
+        <w:spacing w:before="240" w:after="240" w:line="276" w:lineRule="auto"/>
+      </w:pPr>
+      <w:r>
+        <w:lastRenderedPageBreak/>
+        <w:t xml:space="preserve">9. DATA WAREHOUSING ET NOSQL (HIVE &amp; HBASE) </w:t>
+      </w:r>
+    </w:p>
+    <w:p>
+      <w:pPr>
+        <w:spacing w:before="240" w:after="240" w:line="276" w:lineRule="auto"/>
+        <w:rPr>
+          <w:lang w:val="fr-SN"/>
+        </w:rPr>
+      </w:pPr>
+      <w:r>
+        <w:rPr>
+          <w:sz w:val="25"/>
+          <w:lang w:val="fr-SN"/>
+        </w:rPr>
+        <w:t xml:space="preserve">Pour les requêtes SQL complexes, nous utilisons </w:t>
+      </w:r>
+      <w:proofErr w:type="spellStart"/>
+      <w:r>
+        <w:rPr>
+          <w:sz w:val="25"/>
+          <w:lang w:val="fr-SN"/>
+        </w:rPr>
+        <w:t>Hive</w:t>
+      </w:r>
+      <w:proofErr w:type="spellEnd"/>
+      <w:r>
+        <w:rPr>
+          <w:sz w:val="25"/>
+          <w:lang w:val="fr-SN"/>
+        </w:rPr>
+        <w:t>. Pour les accès rapides et le monitoring, nous utilisons HBase.</w:t>
+      </w:r>
+    </w:p>
+    <w:tbl>
+      <w:tblPr>
+        <w:tblW w:w="0" w:type="auto"/>
+        <w:jc w:val="center"/>
+        <w:tblLayout w:type="fixed"/>
+        <w:tblLook w:val="04A0" w:firstRow="1" w:lastRow="0" w:firstColumn="1" w:lastColumn="0" w:noHBand="0" w:noVBand="1"/>
+      </w:tblPr>
+      <w:tblGrid>
+        <w:gridCol w:w="18720"/>
+      </w:tblGrid>
+      <w:tr>
+        <w:trPr>
+          <w:jc w:val="center"/>
+        </w:trPr>
         <w:tc>
           <w:tcPr>
-            <w:tcW w:w="5112" w:type="dxa"/>
+            <w:tcW w:w="18720" w:type="dxa"/>
             <w:tcBorders>
               <w:top w:val="nil"/>
               <w:left w:val="nil"/>
@@ -963,17 +1546,35 @@
           </w:tcPr>
           <w:p>
             <w:pPr>
+              <w:spacing w:line="276" w:lineRule="auto"/>
+              <w:jc w:val="center"/>
+              <w:rPr>
+                <w:lang w:val="fr-SN"/>
+              </w:rPr>
+            </w:pPr>
+            <w:r>
+              <w:rPr>
+                <w:sz w:val="25"/>
+                <w:lang w:val="fr-SN"/>
+              </w:rPr>
+              <w:t>Description technique de l'étape du pipeline Big Data ci-contre.</w:t>
+            </w:r>
+          </w:p>
+          <w:p>
+            <w:pPr>
+              <w:spacing w:line="276" w:lineRule="auto"/>
               <w:jc w:val="center"/>
             </w:pPr>
             <w:r>
               <w:rPr>
                 <w:noProof/>
+                <w:sz w:val="25"/>
               </w:rPr>
               <w:drawing>
-                <wp:inline distT="0" distB="0" distL="0" distR="0" wp14:anchorId="558E9FCB" wp14:editId="5B950C7B">
-                  <wp:extent cx="2926080" cy="2999022"/>
-                  <wp:effectExtent l="0" t="0" r="0" b="0"/>
-                  <wp:docPr id="4" name="Picture 4"/>
+                <wp:inline distT="0" distB="0" distL="0" distR="0" wp14:anchorId="1B983BD5" wp14:editId="00C6E12E">
+                  <wp:extent cx="5868000" cy="4570563"/>
+                  <wp:effectExtent l="0" t="0" r="0" b="1905"/>
+                  <wp:docPr id="18" name="Image 18"/>
                   <wp:cNvGraphicFramePr>
                     <a:graphicFrameLocks xmlns:a="http://schemas.openxmlformats.org/drawingml/2006/main" noChangeAspect="1"/>
                   </wp:cNvGraphicFramePr>
@@ -981,11 +1582,320 @@
                     <a:graphicData uri="http://schemas.openxmlformats.org/drawingml/2006/picture">
                       <pic:pic xmlns:pic="http://schemas.openxmlformats.org/drawingml/2006/picture">
                         <pic:nvPicPr>
-                          <pic:cNvPr id="0" name="vscode_nifi_xml.png"/>
+                          <pic:cNvPr id="0" name="Picture 3"/>
+                          <pic:cNvPicPr>
+                            <a:picLocks noChangeAspect="1" noChangeArrowheads="1"/>
+                          </pic:cNvPicPr>
+                        </pic:nvPicPr>
+                        <pic:blipFill>
+                          <a:blip r:embed="rId11">
+                            <a:extLst>
+                              <a:ext uri="{28A0092B-C50C-407E-A947-70E740481C1C}">
+                                <a14:useLocalDpi xmlns:a14="http://schemas.microsoft.com/office/drawing/2010/main" val="0"/>
+                              </a:ext>
+                            </a:extLst>
+                          </a:blip>
+                          <a:srcRect/>
+                          <a:stretch>
+                            <a:fillRect/>
+                          </a:stretch>
+                        </pic:blipFill>
+                        <pic:spPr bwMode="auto">
+                          <a:xfrm>
+                            <a:off x="0" y="0"/>
+                            <a:ext cx="5868000" cy="4570563"/>
+                          </a:xfrm>
+                          <a:prstGeom prst="rect">
+                            <a:avLst/>
+                          </a:prstGeom>
+                          <a:noFill/>
+                          <a:ln>
+                            <a:noFill/>
+                          </a:ln>
+                        </pic:spPr>
+                      </pic:pic>
+                    </a:graphicData>
+                  </a:graphic>
+                </wp:inline>
+              </w:drawing>
+            </w:r>
+          </w:p>
+          <w:p>
+            <w:pPr>
+              <w:spacing w:line="276" w:lineRule="auto"/>
+              <w:jc w:val="center"/>
+            </w:pPr>
+            <w:r>
+              <w:rPr>
+                <w:i/>
+                <w:sz w:val="25"/>
+              </w:rPr>
+              <w:t>HBase Master UI</w:t>
+            </w:r>
+          </w:p>
+        </w:tc>
+      </w:tr>
+    </w:tbl>
+    <w:p>
+      <w:pPr>
+        <w:spacing w:before="240" w:after="240" w:line="276" w:lineRule="auto"/>
+        <w:rPr>
+          <w:lang w:val="fr-SN"/>
+        </w:rPr>
+      </w:pPr>
+      <w:r>
+        <w:rPr>
+          <w:sz w:val="25"/>
+          <w:lang w:val="fr-SN"/>
+        </w:rPr>
+        <w:t>Figure 11 : État du Master HBase et monitoring des tables de drift.</w:t>
+      </w:r>
+    </w:p>
+    <w:tbl>
+      <w:tblPr>
+        <w:tblW w:w="0" w:type="auto"/>
+        <w:jc w:val="center"/>
+        <w:tblLayout w:type="fixed"/>
+        <w:tblLook w:val="04A0" w:firstRow="1" w:lastRow="0" w:firstColumn="1" w:lastColumn="0" w:noHBand="0" w:noVBand="1"/>
+      </w:tblPr>
+      <w:tblGrid>
+        <w:gridCol w:w="18720"/>
+      </w:tblGrid>
+      <w:tr>
+        <w:trPr>
+          <w:jc w:val="center"/>
+        </w:trPr>
+        <w:tc>
+          <w:tcPr>
+            <w:tcW w:w="18720" w:type="dxa"/>
+            <w:tcBorders>
+              <w:top w:val="nil"/>
+              <w:left w:val="nil"/>
+              <w:bottom w:val="nil"/>
+              <w:right w:val="nil"/>
+            </w:tcBorders>
+          </w:tcPr>
+          <w:p>
+            <w:pPr>
+              <w:spacing w:line="276" w:lineRule="auto"/>
+              <w:jc w:val="center"/>
+              <w:rPr>
+                <w:lang w:val="fr-SN"/>
+              </w:rPr>
+            </w:pPr>
+            <w:r>
+              <w:rPr>
+                <w:sz w:val="25"/>
+                <w:lang w:val="fr-SN"/>
+              </w:rPr>
+              <w:t>Description technique de l'étape du pipeline Big Data ci-contre.</w:t>
+            </w:r>
+          </w:p>
+          <w:p>
+            <w:pPr>
+              <w:spacing w:line="276" w:lineRule="auto"/>
+              <w:jc w:val="center"/>
+            </w:pPr>
+            <w:r>
+              <w:rPr>
+                <w:noProof/>
+                <w:sz w:val="25"/>
+              </w:rPr>
+              <w:lastRenderedPageBreak/>
+              <w:drawing>
+                <wp:inline distT="0" distB="0" distL="0" distR="0" wp14:anchorId="4821F703" wp14:editId="02A9F4AE">
+                  <wp:extent cx="4205836" cy="5125250"/>
+                  <wp:effectExtent l="0" t="0" r="4445" b="0"/>
+                  <wp:docPr id="17" name="Image 17"/>
+                  <wp:cNvGraphicFramePr>
+                    <a:graphicFrameLocks xmlns:a="http://schemas.openxmlformats.org/drawingml/2006/main" noChangeAspect="1"/>
+                  </wp:cNvGraphicFramePr>
+                  <a:graphic xmlns:a="http://schemas.openxmlformats.org/drawingml/2006/main">
+                    <a:graphicData uri="http://schemas.openxmlformats.org/drawingml/2006/picture">
+                      <pic:pic xmlns:pic="http://schemas.openxmlformats.org/drawingml/2006/picture">
+                        <pic:nvPicPr>
+                          <pic:cNvPr id="0" name="Picture 2"/>
+                          <pic:cNvPicPr>
+                            <a:picLocks noChangeAspect="1" noChangeArrowheads="1"/>
+                          </pic:cNvPicPr>
+                        </pic:nvPicPr>
+                        <pic:blipFill>
+                          <a:blip r:embed="rId12">
+                            <a:extLst>
+                              <a:ext uri="{28A0092B-C50C-407E-A947-70E740481C1C}">
+                                <a14:useLocalDpi xmlns:a14="http://schemas.microsoft.com/office/drawing/2010/main" val="0"/>
+                              </a:ext>
+                            </a:extLst>
+                          </a:blip>
+                          <a:srcRect/>
+                          <a:stretch>
+                            <a:fillRect/>
+                          </a:stretch>
+                        </pic:blipFill>
+                        <pic:spPr bwMode="auto">
+                          <a:xfrm>
+                            <a:off x="0" y="0"/>
+                            <a:ext cx="4231738" cy="5156815"/>
+                          </a:xfrm>
+                          <a:prstGeom prst="rect">
+                            <a:avLst/>
+                          </a:prstGeom>
+                          <a:noFill/>
+                          <a:ln>
+                            <a:noFill/>
+                          </a:ln>
+                        </pic:spPr>
+                      </pic:pic>
+                    </a:graphicData>
+                  </a:graphic>
+                </wp:inline>
+              </w:drawing>
+            </w:r>
+          </w:p>
+          <w:p>
+            <w:pPr>
+              <w:spacing w:line="276" w:lineRule="auto"/>
+              <w:jc w:val="center"/>
+            </w:pPr>
+            <w:r>
+              <w:rPr>
+                <w:i/>
+                <w:sz w:val="25"/>
+              </w:rPr>
+              <w:t>HBase Logs</w:t>
+            </w:r>
+          </w:p>
+        </w:tc>
+      </w:tr>
+    </w:tbl>
+    <w:p>
+      <w:pPr>
+        <w:spacing w:before="240" w:after="240" w:line="276" w:lineRule="auto"/>
+        <w:rPr>
+          <w:lang w:val="fr-SN"/>
+        </w:rPr>
+      </w:pPr>
+      <w:r>
+        <w:rPr>
+          <w:sz w:val="25"/>
+          <w:lang w:val="fr-SN"/>
+        </w:rPr>
+        <w:t>Figure 12 : Consultation des journaux d'exécution du service HBase.</w:t>
+      </w:r>
+    </w:p>
+    <w:p>
+      <w:pPr>
+        <w:pStyle w:val="Titre1"/>
+        <w:spacing w:before="240" w:after="240" w:line="276" w:lineRule="auto"/>
+        <w:rPr>
+          <w:lang w:val="fr-SN"/>
+        </w:rPr>
+      </w:pPr>
+      <w:r>
+        <w:rPr>
+          <w:lang w:val="fr-SN"/>
+        </w:rPr>
+        <w:t xml:space="preserve">10. VISUALISATION ET BUSINESS INTELLIGENCE </w:t>
+      </w:r>
+    </w:p>
+    <w:p>
+      <w:pPr>
+        <w:spacing w:before="240" w:after="240" w:line="276" w:lineRule="auto"/>
+        <w:rPr>
+          <w:lang w:val="fr-SN"/>
+        </w:rPr>
+      </w:pPr>
+      <w:r>
+        <w:rPr>
+          <w:sz w:val="25"/>
+          <w:lang w:val="fr-SN"/>
+        </w:rPr>
+        <w:t xml:space="preserve">Le </w:t>
+      </w:r>
+      <w:proofErr w:type="spellStart"/>
+      <w:r>
+        <w:rPr>
+          <w:sz w:val="25"/>
+          <w:lang w:val="fr-SN"/>
+        </w:rPr>
+        <w:t>dashboard</w:t>
+      </w:r>
+      <w:proofErr w:type="spellEnd"/>
+      <w:r>
+        <w:rPr>
+          <w:sz w:val="25"/>
+          <w:lang w:val="fr-SN"/>
+        </w:rPr>
+        <w:t xml:space="preserve"> final consolide les prédictions pour offrir une aide à la décision aux acteurs agricoles.</w:t>
+      </w:r>
+    </w:p>
+    <w:tbl>
+      <w:tblPr>
+        <w:tblW w:w="0" w:type="auto"/>
+        <w:jc w:val="center"/>
+        <w:tblLayout w:type="fixed"/>
+        <w:tblLook w:val="04A0" w:firstRow="1" w:lastRow="0" w:firstColumn="1" w:lastColumn="0" w:noHBand="0" w:noVBand="1"/>
+      </w:tblPr>
+      <w:tblGrid>
+        <w:gridCol w:w="18720"/>
+      </w:tblGrid>
+      <w:tr>
+        <w:trPr>
+          <w:jc w:val="center"/>
+        </w:trPr>
+        <w:tc>
+          <w:tcPr>
+            <w:tcW w:w="18720" w:type="dxa"/>
+            <w:tcBorders>
+              <w:top w:val="nil"/>
+              <w:left w:val="nil"/>
+              <w:bottom w:val="nil"/>
+              <w:right w:val="nil"/>
+            </w:tcBorders>
+          </w:tcPr>
+          <w:p>
+            <w:pPr>
+              <w:spacing w:line="276" w:lineRule="auto"/>
+              <w:jc w:val="center"/>
+              <w:rPr>
+                <w:lang w:val="fr-SN"/>
+              </w:rPr>
+            </w:pPr>
+            <w:r>
+              <w:rPr>
+                <w:sz w:val="25"/>
+                <w:lang w:val="fr-SN"/>
+              </w:rPr>
+              <w:t>Description technique de l'étape du pipeline Big Data ci-contre.</w:t>
+            </w:r>
+          </w:p>
+          <w:p>
+            <w:pPr>
+              <w:spacing w:line="276" w:lineRule="auto"/>
+              <w:jc w:val="center"/>
+            </w:pPr>
+            <w:r>
+              <w:rPr>
+                <w:noProof/>
+              </w:rPr>
+              <w:lastRenderedPageBreak/>
+              <w:drawing>
+                <wp:inline distT="0" distB="0" distL="0" distR="0" wp14:anchorId="180D33DB" wp14:editId="4D3F9841">
+                  <wp:extent cx="6120000" cy="4590000"/>
+                  <wp:effectExtent l="0" t="0" r="0" b="1270"/>
+                  <wp:docPr id="16" name="Image 16" descr="Une image contenant texte, diagramme, capture d’écran, Plan&#10;&#10;Description générée automatiquement"/>
+                  <wp:cNvGraphicFramePr>
+                    <a:graphicFrameLocks xmlns:a="http://schemas.openxmlformats.org/drawingml/2006/main" noChangeAspect="1"/>
+                  </wp:cNvGraphicFramePr>
+                  <a:graphic xmlns:a="http://schemas.openxmlformats.org/drawingml/2006/main">
+                    <a:graphicData uri="http://schemas.openxmlformats.org/drawingml/2006/picture">
+                      <pic:pic xmlns:pic="http://schemas.openxmlformats.org/drawingml/2006/picture">
+                        <pic:nvPicPr>
+                          <pic:cNvPr id="16" name="Image 16" descr="Une image contenant texte, diagramme, capture d’écran, Plan&#10;&#10;Description générée automatiquement"/>
                           <pic:cNvPicPr/>
                         </pic:nvPicPr>
                         <pic:blipFill>
-                          <a:blip r:embed="rId9"/>
+                          <a:blip r:embed="rId13"/>
                           <a:stretch>
                             <a:fillRect/>
                           </a:stretch>
@@ -993,7 +1903,7 @@
                         <pic:spPr>
                           <a:xfrm>
                             <a:off x="0" y="0"/>
-                            <a:ext cx="2926080" cy="2999022"/>
+                            <a:ext cx="6120000" cy="4590000"/>
                           </a:xfrm>
                           <a:prstGeom prst="rect">
                             <a:avLst/>
@@ -1008,1538 +1918,13 @@
           </w:p>
           <w:p>
             <w:pPr>
+              <w:spacing w:line="276" w:lineRule="auto"/>
               <w:jc w:val="center"/>
             </w:pPr>
             <w:r>
               <w:rPr>
                 <w:i/>
-                <w:sz w:val="16"/>
-              </w:rPr>
-              <w:t>Template NiFi XML</w:t>
-            </w:r>
-          </w:p>
-        </w:tc>
-      </w:tr>
-    </w:tbl>
-    <w:p>
-      <w:pPr>
-        <w:rPr>
-          <w:lang w:val="fr-SN"/>
-        </w:rPr>
-      </w:pPr>
-      <w:r>
-        <w:rPr>
-          <w:lang w:val="fr-SN"/>
-        </w:rPr>
-        <w:t xml:space="preserve">Figure 3 : Structure technique (XML) du </w:t>
-      </w:r>
-      <w:proofErr w:type="spellStart"/>
-      <w:r>
-        <w:rPr>
-          <w:lang w:val="fr-SN"/>
-        </w:rPr>
-        <w:t>template</w:t>
-      </w:r>
-      <w:proofErr w:type="spellEnd"/>
-      <w:r>
-        <w:rPr>
-          <w:lang w:val="fr-SN"/>
-        </w:rPr>
-        <w:t xml:space="preserve"> d'ingestion Agri-Insight.</w:t>
-      </w:r>
-    </w:p>
-    <w:p>
-      <w:pPr>
-        <w:pStyle w:val="Titre1"/>
-      </w:pPr>
-      <w:r>
-        <w:t xml:space="preserve">5. STOCKAGE ET ARCHITECTURE MÉDAILLON (HDFS) </w:t>
-      </w:r>
-    </w:p>
-    <w:p>
-      <w:pPr>
-        <w:rPr>
-          <w:lang w:val="fr-SN"/>
-        </w:rPr>
-      </w:pPr>
-      <w:r>
-        <w:rPr>
-          <w:lang w:val="fr-SN"/>
-        </w:rPr>
-        <w:t>Nous utilisons une architecture de données en "Médaillon" pour garantir la qualité.</w:t>
-      </w:r>
-    </w:p>
-    <w:tbl>
-      <w:tblPr>
-        <w:tblW w:w="0" w:type="auto"/>
-        <w:tblLook w:val="04A0" w:firstRow="1" w:lastRow="0" w:firstColumn="1" w:lastColumn="0" w:noHBand="0" w:noVBand="1"/>
-      </w:tblPr>
-      <w:tblGrid>
-        <w:gridCol w:w="4644"/>
-        <w:gridCol w:w="5796"/>
-      </w:tblGrid>
-      <w:tr>
-        <w:tc>
-          <w:tcPr>
-            <w:tcW w:w="5112" w:type="dxa"/>
-            <w:tcBorders>
-              <w:top w:val="nil"/>
-              <w:left w:val="nil"/>
-              <w:bottom w:val="nil"/>
-              <w:right w:val="nil"/>
-            </w:tcBorders>
-          </w:tcPr>
-          <w:p>
-            <w:pPr>
-              <w:rPr>
-                <w:lang w:val="fr-SN"/>
-              </w:rPr>
-            </w:pPr>
-            <w:r>
-              <w:rPr>
-                <w:lang w:val="fr-SN"/>
-              </w:rPr>
-              <w:lastRenderedPageBreak/>
-              <w:t>Description technique de l'étape du pipeline Big Data ci-contre.</w:t>
-            </w:r>
-          </w:p>
-        </w:tc>
-        <w:tc>
-          <w:tcPr>
-            <w:tcW w:w="5112" w:type="dxa"/>
-            <w:tcBorders>
-              <w:top w:val="nil"/>
-              <w:left w:val="nil"/>
-              <w:bottom w:val="nil"/>
-              <w:right w:val="nil"/>
-            </w:tcBorders>
-          </w:tcPr>
-          <w:p>
-            <w:pPr>
-              <w:jc w:val="center"/>
-            </w:pPr>
-            <w:r>
-              <w:drawing>
-                <wp:inline distT="0" distB="0" distL="0" distR="0" wp14:anchorId="16396787" wp14:editId="33456F40">
-                  <wp:extent cx="3543795" cy="7392432"/>
-                  <wp:effectExtent l="0" t="0" r="0" b="0"/>
-                  <wp:docPr id="15" name="Image 15"/>
-                  <wp:cNvGraphicFramePr>
-                    <a:graphicFrameLocks xmlns:a="http://schemas.openxmlformats.org/drawingml/2006/main" noChangeAspect="1"/>
-                  </wp:cNvGraphicFramePr>
-                  <a:graphic xmlns:a="http://schemas.openxmlformats.org/drawingml/2006/main">
-                    <a:graphicData uri="http://schemas.openxmlformats.org/drawingml/2006/picture">
-                      <pic:pic xmlns:pic="http://schemas.openxmlformats.org/drawingml/2006/picture">
-                        <pic:nvPicPr>
-                          <pic:cNvPr id="1" name=""/>
-                          <pic:cNvPicPr/>
-                        </pic:nvPicPr>
-                        <pic:blipFill>
-                          <a:blip r:embed="rId10"/>
-                          <a:stretch>
-                            <a:fillRect/>
-                          </a:stretch>
-                        </pic:blipFill>
-                        <pic:spPr>
-                          <a:xfrm>
-                            <a:off x="0" y="0"/>
-                            <a:ext cx="3543795" cy="7392432"/>
-                          </a:xfrm>
-                          <a:prstGeom prst="rect">
-                            <a:avLst/>
-                          </a:prstGeom>
-                        </pic:spPr>
-                      </pic:pic>
-                    </a:graphicData>
-                  </a:graphic>
-                </wp:inline>
-              </w:drawing>
-            </w:r>
-          </w:p>
-          <w:p>
-            <w:pPr>
-              <w:jc w:val="center"/>
-            </w:pPr>
-            <w:r>
-              <w:rPr>
-                <w:i/>
-                <w:sz w:val="16"/>
-              </w:rPr>
-              <w:t>Structure des dossiers</w:t>
-            </w:r>
-          </w:p>
-        </w:tc>
-      </w:tr>
-    </w:tbl>
-    <w:p>
-      <w:pPr>
-        <w:rPr>
-          <w:lang w:val="fr-SN"/>
-        </w:rPr>
-      </w:pPr>
-      <w:r>
-        <w:rPr>
-          <w:lang w:val="fr-SN"/>
-        </w:rPr>
-        <w:t>Figure 4 : Organisation physique des répertoires Bronze, Silver et Gold sur le système hôte.</w:t>
-      </w:r>
-    </w:p>
-    <w:p>
-      <w:pPr>
-        <w:pStyle w:val="Titre2"/>
-        <w:rPr>
-          <w:lang w:val="fr-SN"/>
-        </w:rPr>
-      </w:pPr>
-      <w:r>
-        <w:rPr>
-          <w:lang w:val="fr-SN"/>
-        </w:rPr>
-        <w:t>5.1. Couche Bronze (Données Brutes)</w:t>
-      </w:r>
-    </w:p>
-    <w:p>
-      <w:pPr>
-        <w:rPr>
-          <w:lang w:val="fr-SN"/>
-        </w:rPr>
-      </w:pPr>
-      <w:r>
-        <w:rPr>
-          <w:lang w:val="fr-SN"/>
-        </w:rPr>
-        <w:t>Les fichiers CSV entrants sont stockés sans modification pour garantir l'</w:t>
-      </w:r>
-      <w:proofErr w:type="spellStart"/>
-      <w:r>
-        <w:rPr>
-          <w:lang w:val="fr-SN"/>
-        </w:rPr>
-        <w:t>auditabilité</w:t>
-      </w:r>
-      <w:proofErr w:type="spellEnd"/>
-      <w:r>
-        <w:rPr>
-          <w:lang w:val="fr-SN"/>
-        </w:rPr>
-        <w:t>.</w:t>
-      </w:r>
-    </w:p>
-    <w:tbl>
-      <w:tblPr>
-        <w:tblW w:w="0" w:type="auto"/>
-        <w:tblLook w:val="04A0" w:firstRow="1" w:lastRow="0" w:firstColumn="1" w:lastColumn="0" w:noHBand="0" w:noVBand="1"/>
-      </w:tblPr>
-      <w:tblGrid>
-        <w:gridCol w:w="5112"/>
-        <w:gridCol w:w="5112"/>
-      </w:tblGrid>
-      <w:tr>
-        <w:tc>
-          <w:tcPr>
-            <w:tcW w:w="5112" w:type="dxa"/>
-            <w:tcBorders>
-              <w:top w:val="nil"/>
-              <w:left w:val="nil"/>
-              <w:bottom w:val="nil"/>
-              <w:right w:val="nil"/>
-            </w:tcBorders>
-          </w:tcPr>
-          <w:p>
-            <w:pPr>
-              <w:rPr>
-                <w:lang w:val="fr-SN"/>
-              </w:rPr>
-            </w:pPr>
-            <w:r>
-              <w:rPr>
-                <w:lang w:val="fr-SN"/>
-              </w:rPr>
-              <w:lastRenderedPageBreak/>
-              <w:t>Description technique de l'étape du pipeline Big Data ci-contre.</w:t>
-            </w:r>
-          </w:p>
-        </w:tc>
-        <w:tc>
-          <w:tcPr>
-            <w:tcW w:w="5112" w:type="dxa"/>
-            <w:tcBorders>
-              <w:top w:val="nil"/>
-              <w:left w:val="nil"/>
-              <w:bottom w:val="nil"/>
-              <w:right w:val="nil"/>
-            </w:tcBorders>
-          </w:tcPr>
-          <w:p>
-            <w:pPr>
-              <w:jc w:val="center"/>
-            </w:pPr>
-            <w:r>
-              <w:rPr>
-                <w:noProof/>
-              </w:rPr>
-              <w:drawing>
-                <wp:inline distT="0" distB="0" distL="0" distR="0" wp14:anchorId="55EDE113" wp14:editId="21E07801">
-                  <wp:extent cx="2926080" cy="1435435"/>
-                  <wp:effectExtent l="0" t="0" r="0" b="0"/>
-                  <wp:docPr id="6" name="Picture 6"/>
-                  <wp:cNvGraphicFramePr>
-                    <a:graphicFrameLocks xmlns:a="http://schemas.openxmlformats.org/drawingml/2006/main" noChangeAspect="1"/>
-                  </wp:cNvGraphicFramePr>
-                  <a:graphic xmlns:a="http://schemas.openxmlformats.org/drawingml/2006/main">
-                    <a:graphicData uri="http://schemas.openxmlformats.org/drawingml/2006/picture">
-                      <pic:pic xmlns:pic="http://schemas.openxmlformats.org/drawingml/2006/picture">
-                        <pic:nvPicPr>
-                          <pic:cNvPr id="0" name="hdfs_bronze.png"/>
-                          <pic:cNvPicPr/>
-                        </pic:nvPicPr>
-                        <pic:blipFill>
-                          <a:blip r:embed="rId11"/>
-                          <a:stretch>
-                            <a:fillRect/>
-                          </a:stretch>
-                        </pic:blipFill>
-                        <pic:spPr>
-                          <a:xfrm>
-                            <a:off x="0" y="0"/>
-                            <a:ext cx="2926080" cy="1435435"/>
-                          </a:xfrm>
-                          <a:prstGeom prst="rect">
-                            <a:avLst/>
-                          </a:prstGeom>
-                        </pic:spPr>
-                      </pic:pic>
-                    </a:graphicData>
-                  </a:graphic>
-                </wp:inline>
-              </w:drawing>
-            </w:r>
-          </w:p>
-          <w:p>
-            <w:pPr>
-              <w:jc w:val="center"/>
-            </w:pPr>
-            <w:r>
-              <w:rPr>
-                <w:i/>
-                <w:sz w:val="16"/>
-              </w:rPr>
-              <w:t>HDFS Browser Bronze</w:t>
-            </w:r>
-          </w:p>
-        </w:tc>
-      </w:tr>
-    </w:tbl>
-    <w:p>
-      <w:pPr>
-        <w:rPr>
-          <w:lang w:val="fr-SN"/>
-        </w:rPr>
-      </w:pPr>
-      <w:r>
-        <w:rPr>
-          <w:lang w:val="fr-SN"/>
-        </w:rPr>
-        <w:t>Figure 5 : Exploration du HDFS montrant les données brutes dans /</w:t>
-      </w:r>
-      <w:proofErr w:type="spellStart"/>
-      <w:r>
-        <w:rPr>
-          <w:lang w:val="fr-SN"/>
-        </w:rPr>
-        <w:t>agriinsight</w:t>
-      </w:r>
-      <w:proofErr w:type="spellEnd"/>
-      <w:r>
-        <w:rPr>
-          <w:lang w:val="fr-SN"/>
-        </w:rPr>
-        <w:t>/</w:t>
-      </w:r>
-      <w:proofErr w:type="gramStart"/>
-      <w:r>
-        <w:rPr>
-          <w:lang w:val="fr-SN"/>
-        </w:rPr>
-        <w:t>bronze.*</w:t>
-      </w:r>
-      <w:proofErr w:type="gramEnd"/>
-    </w:p>
-    <w:p>
-      <w:pPr>
-        <w:pStyle w:val="Titre1"/>
-      </w:pPr>
-      <w:r>
-        <w:t xml:space="preserve">6. TRAITEMENT ET FEATURE ENGINEERING (SPARK) </w:t>
-      </w:r>
-    </w:p>
-    <w:p>
-      <w:pPr>
-        <w:rPr>
-          <w:lang w:val="fr-SN"/>
-        </w:rPr>
-      </w:pPr>
-      <w:r>
-        <w:rPr>
-          <w:lang w:val="fr-SN"/>
-        </w:rPr>
-        <w:t>Apache Spark est le moteur de calcul principal. Il transforme les données Bronze en données Silver (nettoyées et enrichies).</w:t>
-      </w:r>
-    </w:p>
-    <w:tbl>
-      <w:tblPr>
-        <w:tblW w:w="0" w:type="auto"/>
-        <w:tblLook w:val="04A0" w:firstRow="1" w:lastRow="0" w:firstColumn="1" w:lastColumn="0" w:noHBand="0" w:noVBand="1"/>
-      </w:tblPr>
-      <w:tblGrid>
-        <w:gridCol w:w="5112"/>
-        <w:gridCol w:w="5112"/>
-      </w:tblGrid>
-      <w:tr>
-        <w:tc>
-          <w:tcPr>
-            <w:tcW w:w="5112" w:type="dxa"/>
-            <w:tcBorders>
-              <w:top w:val="nil"/>
-              <w:left w:val="nil"/>
-              <w:bottom w:val="nil"/>
-              <w:right w:val="nil"/>
-            </w:tcBorders>
-          </w:tcPr>
-          <w:p>
-            <w:pPr>
-              <w:rPr>
-                <w:lang w:val="fr-SN"/>
-              </w:rPr>
-            </w:pPr>
-            <w:r>
-              <w:rPr>
-                <w:lang w:val="fr-SN"/>
-              </w:rPr>
-              <w:t>Description technique de l'étape du pipeline Big Data ci-contre.</w:t>
-            </w:r>
-          </w:p>
-        </w:tc>
-        <w:tc>
-          <w:tcPr>
-            <w:tcW w:w="5112" w:type="dxa"/>
-            <w:tcBorders>
-              <w:top w:val="nil"/>
-              <w:left w:val="nil"/>
-              <w:bottom w:val="nil"/>
-              <w:right w:val="nil"/>
-            </w:tcBorders>
-          </w:tcPr>
-          <w:p>
-            <w:pPr>
-              <w:jc w:val="center"/>
-            </w:pPr>
-            <w:r>
-              <w:rPr>
-                <w:noProof/>
-              </w:rPr>
-              <w:drawing>
-                <wp:inline distT="0" distB="0" distL="0" distR="0" wp14:anchorId="3B687BF4" wp14:editId="32682552">
-                  <wp:extent cx="2926080" cy="1180293"/>
-                  <wp:effectExtent l="0" t="0" r="0" b="0"/>
-                  <wp:docPr id="7" name="Picture 7"/>
-                  <wp:cNvGraphicFramePr>
-                    <a:graphicFrameLocks xmlns:a="http://schemas.openxmlformats.org/drawingml/2006/main" noChangeAspect="1"/>
-                  </wp:cNvGraphicFramePr>
-                  <a:graphic xmlns:a="http://schemas.openxmlformats.org/drawingml/2006/main">
-                    <a:graphicData uri="http://schemas.openxmlformats.org/drawingml/2006/picture">
-                      <pic:pic xmlns:pic="http://schemas.openxmlformats.org/drawingml/2006/picture">
-                        <pic:nvPicPr>
-                          <pic:cNvPr id="0" name="spark_master.png"/>
-                          <pic:cNvPicPr/>
-                        </pic:nvPicPr>
-                        <pic:blipFill>
-                          <a:blip r:embed="rId12"/>
-                          <a:stretch>
-                            <a:fillRect/>
-                          </a:stretch>
-                        </pic:blipFill>
-                        <pic:spPr>
-                          <a:xfrm>
-                            <a:off x="0" y="0"/>
-                            <a:ext cx="2926080" cy="1180293"/>
-                          </a:xfrm>
-                          <a:prstGeom prst="rect">
-                            <a:avLst/>
-                          </a:prstGeom>
-                        </pic:spPr>
-                      </pic:pic>
-                    </a:graphicData>
-                  </a:graphic>
-                </wp:inline>
-              </w:drawing>
-            </w:r>
-          </w:p>
-          <w:p>
-            <w:pPr>
-              <w:jc w:val="center"/>
-            </w:pPr>
-            <w:r>
-              <w:rPr>
-                <w:i/>
-                <w:sz w:val="16"/>
-              </w:rPr>
-              <w:t>Spark Master UI</w:t>
-            </w:r>
-          </w:p>
-        </w:tc>
-      </w:tr>
-    </w:tbl>
-    <w:p>
-      <w:pPr>
-        <w:rPr>
-          <w:lang w:val="fr-SN"/>
-        </w:rPr>
-      </w:pPr>
-      <w:r>
-        <w:rPr>
-          <w:lang w:val="fr-SN"/>
-        </w:rPr>
-        <w:t>Figure 6 : Dashboard du Spark Master supervisant les ressources du cluster.</w:t>
-      </w:r>
-    </w:p>
-    <w:tbl>
-      <w:tblPr>
-        <w:tblW w:w="0" w:type="auto"/>
-        <w:tblLook w:val="04A0" w:firstRow="1" w:lastRow="0" w:firstColumn="1" w:lastColumn="0" w:noHBand="0" w:noVBand="1"/>
-      </w:tblPr>
-      <w:tblGrid>
-        <w:gridCol w:w="5112"/>
-        <w:gridCol w:w="5112"/>
-      </w:tblGrid>
-      <w:tr>
-        <w:tc>
-          <w:tcPr>
-            <w:tcW w:w="5112" w:type="dxa"/>
-            <w:tcBorders>
-              <w:top w:val="nil"/>
-              <w:left w:val="nil"/>
-              <w:bottom w:val="nil"/>
-              <w:right w:val="nil"/>
-            </w:tcBorders>
-          </w:tcPr>
-          <w:p>
-            <w:pPr>
-              <w:rPr>
-                <w:lang w:val="fr-SN"/>
-              </w:rPr>
-            </w:pPr>
-            <w:r>
-              <w:rPr>
-                <w:lang w:val="fr-SN"/>
-              </w:rPr>
-              <w:t>Description technique de l'étape du pipeline Big Data ci-contre.</w:t>
-            </w:r>
-          </w:p>
-        </w:tc>
-        <w:tc>
-          <w:tcPr>
-            <w:tcW w:w="5112" w:type="dxa"/>
-            <w:tcBorders>
-              <w:top w:val="nil"/>
-              <w:left w:val="nil"/>
-              <w:bottom w:val="nil"/>
-              <w:right w:val="nil"/>
-            </w:tcBorders>
-          </w:tcPr>
-          <w:p>
-            <w:pPr>
-              <w:jc w:val="center"/>
-            </w:pPr>
-            <w:r>
-              <w:rPr>
-                <w:noProof/>
-              </w:rPr>
-              <w:drawing>
-                <wp:inline distT="0" distB="0" distL="0" distR="0" wp14:anchorId="606C80EC" wp14:editId="3D9AB82C">
-                  <wp:extent cx="2926080" cy="1924336"/>
-                  <wp:effectExtent l="0" t="0" r="0" b="0"/>
-                  <wp:docPr id="8" name="Picture 8"/>
-                  <wp:cNvGraphicFramePr>
-                    <a:graphicFrameLocks xmlns:a="http://schemas.openxmlformats.org/drawingml/2006/main" noChangeAspect="1"/>
-                  </wp:cNvGraphicFramePr>
-                  <a:graphic xmlns:a="http://schemas.openxmlformats.org/drawingml/2006/main">
-                    <a:graphicData uri="http://schemas.openxmlformats.org/drawingml/2006/picture">
-                      <pic:pic xmlns:pic="http://schemas.openxmlformats.org/drawingml/2006/picture">
-                        <pic:nvPicPr>
-                          <pic:cNvPr id="0" name="spark_worker.png"/>
-                          <pic:cNvPicPr/>
-                        </pic:nvPicPr>
-                        <pic:blipFill>
-                          <a:blip r:embed="rId13"/>
-                          <a:stretch>
-                            <a:fillRect/>
-                          </a:stretch>
-                        </pic:blipFill>
-                        <pic:spPr>
-                          <a:xfrm>
-                            <a:off x="0" y="0"/>
-                            <a:ext cx="2926080" cy="1924336"/>
-                          </a:xfrm>
-                          <a:prstGeom prst="rect">
-                            <a:avLst/>
-                          </a:prstGeom>
-                        </pic:spPr>
-                      </pic:pic>
-                    </a:graphicData>
-                  </a:graphic>
-                </wp:inline>
-              </w:drawing>
-            </w:r>
-          </w:p>
-          <w:p>
-            <w:pPr>
-              <w:jc w:val="center"/>
-            </w:pPr>
-            <w:r>
-              <w:rPr>
-                <w:i/>
-                <w:sz w:val="16"/>
-              </w:rPr>
-              <w:t>Spark Worker Details</w:t>
-            </w:r>
-          </w:p>
-        </w:tc>
-      </w:tr>
-    </w:tbl>
-    <w:p>
-      <w:pPr>
-        <w:rPr>
-          <w:lang w:val="fr-SN"/>
-        </w:rPr>
-      </w:pPr>
-      <w:r>
-        <w:rPr>
-          <w:lang w:val="fr-SN"/>
-        </w:rPr>
-        <w:t xml:space="preserve">Figure 7 : Détails d'un </w:t>
-      </w:r>
-      <w:proofErr w:type="spellStart"/>
-      <w:r>
-        <w:rPr>
-          <w:lang w:val="fr-SN"/>
-        </w:rPr>
-        <w:t>Worker</w:t>
-      </w:r>
-      <w:proofErr w:type="spellEnd"/>
-      <w:r>
-        <w:rPr>
-          <w:lang w:val="fr-SN"/>
-        </w:rPr>
-        <w:t xml:space="preserve"> Spark (Cœurs et Mémoire utilisés).</w:t>
-      </w:r>
-    </w:p>
-    <w:p>
-      <w:pPr>
-        <w:pStyle w:val="Titre1"/>
-      </w:pPr>
-      <w:r>
-        <w:t xml:space="preserve">7. MACHINE LEARNING ET MLOPS (SPARK MLLIB) </w:t>
-      </w:r>
-    </w:p>
-    <w:p>
-      <w:pPr>
-        <w:rPr>
-          <w:lang w:val="fr-SN"/>
-        </w:rPr>
-      </w:pPr>
-      <w:r>
-        <w:rPr>
-          <w:lang w:val="fr-SN"/>
-        </w:rPr>
-        <w:t xml:space="preserve">Nous entraînons un modèle </w:t>
-      </w:r>
-      <w:proofErr w:type="spellStart"/>
-      <w:r>
-        <w:rPr>
-          <w:lang w:val="fr-SN"/>
-        </w:rPr>
-        <w:t>Random</w:t>
-      </w:r>
-      <w:proofErr w:type="spellEnd"/>
-      <w:r>
-        <w:rPr>
-          <w:lang w:val="fr-SN"/>
-        </w:rPr>
-        <w:t xml:space="preserve"> Forest </w:t>
-      </w:r>
-      <w:proofErr w:type="spellStart"/>
-      <w:r>
-        <w:rPr>
-          <w:lang w:val="fr-SN"/>
-        </w:rPr>
-        <w:t>Regressor</w:t>
-      </w:r>
-      <w:proofErr w:type="spellEnd"/>
-      <w:r>
-        <w:rPr>
-          <w:lang w:val="fr-SN"/>
-        </w:rPr>
-        <w:t xml:space="preserve"> pour prédire les rendements.</w:t>
-      </w:r>
-    </w:p>
-    <w:p>
-      <w:pPr>
-        <w:pStyle w:val="Titre2"/>
-        <w:rPr>
-          <w:lang w:val="fr-SN"/>
-        </w:rPr>
-      </w:pPr>
-      <w:r>
-        <w:rPr>
-          <w:lang w:val="fr-SN"/>
-        </w:rPr>
-        <w:t>7.1. Persistance des Modèles</w:t>
-      </w:r>
-    </w:p>
-    <w:p>
-      <w:pPr>
-        <w:rPr>
-          <w:lang w:val="fr-SN"/>
-        </w:rPr>
-      </w:pPr>
-      <w:r>
-        <w:rPr>
-          <w:lang w:val="fr-SN"/>
-        </w:rPr>
-        <w:t>Le modèle entraîné est stocké sur HDFS avec ses différentes étapes de transformation.</w:t>
-      </w:r>
-    </w:p>
-    <w:tbl>
-      <w:tblPr>
-        <w:tblW w:w="0" w:type="auto"/>
-        <w:tblLook w:val="04A0" w:firstRow="1" w:lastRow="0" w:firstColumn="1" w:lastColumn="0" w:noHBand="0" w:noVBand="1"/>
-      </w:tblPr>
-      <w:tblGrid>
-        <w:gridCol w:w="5112"/>
-        <w:gridCol w:w="5112"/>
-      </w:tblGrid>
-      <w:tr>
-        <w:tc>
-          <w:tcPr>
-            <w:tcW w:w="5112" w:type="dxa"/>
-            <w:tcBorders>
-              <w:top w:val="nil"/>
-              <w:left w:val="nil"/>
-              <w:bottom w:val="nil"/>
-              <w:right w:val="nil"/>
-            </w:tcBorders>
-          </w:tcPr>
-          <w:p>
-            <w:pPr>
-              <w:rPr>
-                <w:lang w:val="fr-SN"/>
-              </w:rPr>
-            </w:pPr>
-            <w:r>
-              <w:rPr>
-                <w:lang w:val="fr-SN"/>
-              </w:rPr>
-              <w:lastRenderedPageBreak/>
-              <w:t>Description technique de l'étape du pipeline Big Data ci-contre.</w:t>
-            </w:r>
-          </w:p>
-        </w:tc>
-        <w:tc>
-          <w:tcPr>
-            <w:tcW w:w="5112" w:type="dxa"/>
-            <w:tcBorders>
-              <w:top w:val="nil"/>
-              <w:left w:val="nil"/>
-              <w:bottom w:val="nil"/>
-              <w:right w:val="nil"/>
-            </w:tcBorders>
-          </w:tcPr>
-          <w:p>
-            <w:pPr>
-              <w:jc w:val="center"/>
-            </w:pPr>
-            <w:r>
-              <w:rPr>
-                <w:noProof/>
-              </w:rPr>
-              <w:drawing>
-                <wp:inline distT="0" distB="0" distL="0" distR="0" wp14:anchorId="73985309" wp14:editId="35B6856B">
-                  <wp:extent cx="2926080" cy="2225410"/>
-                  <wp:effectExtent l="0" t="0" r="0" b="0"/>
-                  <wp:docPr id="9" name="Picture 9"/>
-                  <wp:cNvGraphicFramePr>
-                    <a:graphicFrameLocks xmlns:a="http://schemas.openxmlformats.org/drawingml/2006/main" noChangeAspect="1"/>
-                  </wp:cNvGraphicFramePr>
-                  <a:graphic xmlns:a="http://schemas.openxmlformats.org/drawingml/2006/main">
-                    <a:graphicData uri="http://schemas.openxmlformats.org/drawingml/2006/picture">
-                      <pic:pic xmlns:pic="http://schemas.openxmlformats.org/drawingml/2006/picture">
-                        <pic:nvPicPr>
-                          <pic:cNvPr id="0" name="hdfs_ml_stages.png"/>
-                          <pic:cNvPicPr/>
-                        </pic:nvPicPr>
-                        <pic:blipFill>
-                          <a:blip r:embed="rId14"/>
-                          <a:stretch>
-                            <a:fillRect/>
-                          </a:stretch>
-                        </pic:blipFill>
-                        <pic:spPr>
-                          <a:xfrm>
-                            <a:off x="0" y="0"/>
-                            <a:ext cx="2926080" cy="2225410"/>
-                          </a:xfrm>
-                          <a:prstGeom prst="rect">
-                            <a:avLst/>
-                          </a:prstGeom>
-                        </pic:spPr>
-                      </pic:pic>
-                    </a:graphicData>
-                  </a:graphic>
-                </wp:inline>
-              </w:drawing>
-            </w:r>
-          </w:p>
-          <w:p>
-            <w:pPr>
-              <w:jc w:val="center"/>
-            </w:pPr>
-            <w:r>
-              <w:rPr>
-                <w:i/>
-                <w:sz w:val="16"/>
-              </w:rPr>
-              <w:t>HDFS ML Stages</w:t>
-            </w:r>
-          </w:p>
-        </w:tc>
-      </w:tr>
-    </w:tbl>
-    <w:p>
-      <w:pPr>
-        <w:rPr>
-          <w:lang w:val="fr-SN"/>
-        </w:rPr>
-      </w:pPr>
-      <w:r>
-        <w:rPr>
-          <w:lang w:val="fr-SN"/>
-        </w:rPr>
-        <w:t>Figure 8 : Pipeline de Machine Learning stocké sur HDFS (Stages de transformation).</w:t>
-      </w:r>
-    </w:p>
-    <w:p>
-      <w:pPr>
-        <w:pStyle w:val="Titre1"/>
-        <w:rPr>
-          <w:lang w:val="fr-SN"/>
-        </w:rPr>
-      </w:pPr>
-      <w:r>
-        <w:rPr>
-          <w:lang w:val="fr-SN"/>
-        </w:rPr>
-        <w:t xml:space="preserve">8. ORCHESTRATION ET INDUSTRIALISATION (AIRFLOW) </w:t>
-      </w:r>
-    </w:p>
-    <w:p>
-      <w:pPr>
-        <w:rPr>
-          <w:lang w:val="fr-SN"/>
-        </w:rPr>
-      </w:pPr>
-      <w:r>
-        <w:rPr>
-          <w:lang w:val="fr-SN"/>
-        </w:rPr>
-        <w:t xml:space="preserve">Apache </w:t>
-      </w:r>
-      <w:proofErr w:type="spellStart"/>
-      <w:r>
-        <w:rPr>
-          <w:lang w:val="fr-SN"/>
-        </w:rPr>
-        <w:t>Airflow</w:t>
-      </w:r>
-      <w:proofErr w:type="spellEnd"/>
-      <w:r>
-        <w:rPr>
-          <w:lang w:val="fr-SN"/>
-        </w:rPr>
-        <w:t xml:space="preserve"> orchestre l'ensemble du pipeline. Il permet de gérer les dépendances entre les tâches et d'automatiser le réentraînement des modèles.</w:t>
-      </w:r>
-    </w:p>
-    <w:tbl>
-      <w:tblPr>
-        <w:tblW w:w="0" w:type="auto"/>
-        <w:tblLook w:val="04A0" w:firstRow="1" w:lastRow="0" w:firstColumn="1" w:lastColumn="0" w:noHBand="0" w:noVBand="1"/>
-      </w:tblPr>
-      <w:tblGrid>
-        <w:gridCol w:w="5112"/>
-        <w:gridCol w:w="5112"/>
-      </w:tblGrid>
-      <w:tr>
-        <w:tc>
-          <w:tcPr>
-            <w:tcW w:w="5112" w:type="dxa"/>
-            <w:tcBorders>
-              <w:top w:val="nil"/>
-              <w:left w:val="nil"/>
-              <w:bottom w:val="nil"/>
-              <w:right w:val="nil"/>
-            </w:tcBorders>
-          </w:tcPr>
-          <w:p>
-            <w:pPr>
-              <w:rPr>
-                <w:lang w:val="fr-SN"/>
-              </w:rPr>
-            </w:pPr>
-            <w:r>
-              <w:rPr>
-                <w:lang w:val="fr-SN"/>
-              </w:rPr>
-              <w:t>Description technique de l'étape du pipeline Big Data ci-contre.</w:t>
-            </w:r>
-          </w:p>
-        </w:tc>
-        <w:tc>
-          <w:tcPr>
-            <w:tcW w:w="5112" w:type="dxa"/>
-            <w:tcBorders>
-              <w:top w:val="nil"/>
-              <w:left w:val="nil"/>
-              <w:bottom w:val="nil"/>
-              <w:right w:val="nil"/>
-            </w:tcBorders>
-          </w:tcPr>
-          <w:p>
-            <w:pPr>
-              <w:jc w:val="center"/>
-            </w:pPr>
-            <w:r>
-              <w:rPr>
-                <w:noProof/>
-              </w:rPr>
-              <w:drawing>
-                <wp:inline distT="0" distB="0" distL="0" distR="0" wp14:anchorId="36292B2B" wp14:editId="6469ED88">
-                  <wp:extent cx="2926080" cy="1669672"/>
-                  <wp:effectExtent l="0" t="0" r="0" b="0"/>
-                  <wp:docPr id="10" name="Picture 10"/>
-                  <wp:cNvGraphicFramePr>
-                    <a:graphicFrameLocks xmlns:a="http://schemas.openxmlformats.org/drawingml/2006/main" noChangeAspect="1"/>
-                  </wp:cNvGraphicFramePr>
-                  <a:graphic xmlns:a="http://schemas.openxmlformats.org/drawingml/2006/main">
-                    <a:graphicData uri="http://schemas.openxmlformats.org/drawingml/2006/picture">
-                      <pic:pic xmlns:pic="http://schemas.openxmlformats.org/drawingml/2006/picture">
-                        <pic:nvPicPr>
-                          <pic:cNvPr id="0" name="airflow_dags_list.png"/>
-                          <pic:cNvPicPr/>
-                        </pic:nvPicPr>
-                        <pic:blipFill>
-                          <a:blip r:embed="rId15"/>
-                          <a:stretch>
-                            <a:fillRect/>
-                          </a:stretch>
-                        </pic:blipFill>
-                        <pic:spPr>
-                          <a:xfrm>
-                            <a:off x="0" y="0"/>
-                            <a:ext cx="2926080" cy="1669672"/>
-                          </a:xfrm>
-                          <a:prstGeom prst="rect">
-                            <a:avLst/>
-                          </a:prstGeom>
-                        </pic:spPr>
-                      </pic:pic>
-                    </a:graphicData>
-                  </a:graphic>
-                </wp:inline>
-              </w:drawing>
-            </w:r>
-          </w:p>
-          <w:p>
-            <w:pPr>
-              <w:jc w:val="center"/>
-            </w:pPr>
-            <w:r>
-              <w:rPr>
-                <w:i/>
-                <w:sz w:val="16"/>
-              </w:rPr>
-              <w:t>Liste des DAGs Airflow</w:t>
-            </w:r>
-          </w:p>
-        </w:tc>
-      </w:tr>
-    </w:tbl>
-    <w:p>
-      <w:pPr>
-        <w:rPr>
-          <w:lang w:val="fr-SN"/>
-        </w:rPr>
-      </w:pPr>
-      <w:r>
-        <w:rPr>
-          <w:lang w:val="fr-SN"/>
-        </w:rPr>
-        <w:t>Figure 9 : Liste des Workflows (</w:t>
-      </w:r>
-      <w:proofErr w:type="spellStart"/>
-      <w:r>
-        <w:rPr>
-          <w:lang w:val="fr-SN"/>
-        </w:rPr>
-        <w:t>DAGs</w:t>
-      </w:r>
-      <w:proofErr w:type="spellEnd"/>
-      <w:r>
-        <w:rPr>
-          <w:lang w:val="fr-SN"/>
-        </w:rPr>
-        <w:t>) actifs dans l'orchestrateur.</w:t>
-      </w:r>
-    </w:p>
-    <w:tbl>
-      <w:tblPr>
-        <w:tblW w:w="0" w:type="auto"/>
-        <w:tblLook w:val="04A0" w:firstRow="1" w:lastRow="0" w:firstColumn="1" w:lastColumn="0" w:noHBand="0" w:noVBand="1"/>
-      </w:tblPr>
-      <w:tblGrid>
-        <w:gridCol w:w="5112"/>
-        <w:gridCol w:w="5112"/>
-      </w:tblGrid>
-      <w:tr>
-        <w:tc>
-          <w:tcPr>
-            <w:tcW w:w="5112" w:type="dxa"/>
-            <w:tcBorders>
-              <w:top w:val="nil"/>
-              <w:left w:val="nil"/>
-              <w:bottom w:val="nil"/>
-              <w:right w:val="nil"/>
-            </w:tcBorders>
-          </w:tcPr>
-          <w:p>
-            <w:pPr>
-              <w:rPr>
-                <w:lang w:val="fr-SN"/>
-              </w:rPr>
-            </w:pPr>
-            <w:r>
-              <w:rPr>
-                <w:lang w:val="fr-SN"/>
-              </w:rPr>
-              <w:t>Description technique de l'étape du pipeline Big Data ci-contre.</w:t>
-            </w:r>
-          </w:p>
-        </w:tc>
-        <w:tc>
-          <w:tcPr>
-            <w:tcW w:w="5112" w:type="dxa"/>
-            <w:tcBorders>
-              <w:top w:val="nil"/>
-              <w:left w:val="nil"/>
-              <w:bottom w:val="nil"/>
-              <w:right w:val="nil"/>
-            </w:tcBorders>
-          </w:tcPr>
-          <w:p>
-            <w:pPr>
-              <w:jc w:val="center"/>
-            </w:pPr>
-            <w:r>
-              <w:rPr>
-                <w:noProof/>
-              </w:rPr>
-              <w:drawing>
-                <wp:inline distT="0" distB="0" distL="0" distR="0" wp14:anchorId="4ECA5D3C" wp14:editId="4467B70A">
-                  <wp:extent cx="2926080" cy="3050594"/>
-                  <wp:effectExtent l="0" t="0" r="0" b="0"/>
-                  <wp:docPr id="11" name="Picture 11"/>
-                  <wp:cNvGraphicFramePr>
-                    <a:graphicFrameLocks xmlns:a="http://schemas.openxmlformats.org/drawingml/2006/main" noChangeAspect="1"/>
-                  </wp:cNvGraphicFramePr>
-                  <a:graphic xmlns:a="http://schemas.openxmlformats.org/drawingml/2006/main">
-                    <a:graphicData uri="http://schemas.openxmlformats.org/drawingml/2006/picture">
-                      <pic:pic xmlns:pic="http://schemas.openxmlformats.org/drawingml/2006/picture">
-                        <pic:nvPicPr>
-                          <pic:cNvPr id="0" name="vscode_airflow_code.png"/>
-                          <pic:cNvPicPr/>
-                        </pic:nvPicPr>
-                        <pic:blipFill>
-                          <a:blip r:embed="rId16"/>
-                          <a:stretch>
-                            <a:fillRect/>
-                          </a:stretch>
-                        </pic:blipFill>
-                        <pic:spPr>
-                          <a:xfrm>
-                            <a:off x="0" y="0"/>
-                            <a:ext cx="2926080" cy="3050594"/>
-                          </a:xfrm>
-                          <a:prstGeom prst="rect">
-                            <a:avLst/>
-                          </a:prstGeom>
-                        </pic:spPr>
-                      </pic:pic>
-                    </a:graphicData>
-                  </a:graphic>
-                </wp:inline>
-              </w:drawing>
-            </w:r>
-          </w:p>
-          <w:p>
-            <w:pPr>
-              <w:jc w:val="center"/>
-            </w:pPr>
-            <w:r>
-              <w:rPr>
-                <w:i/>
-                <w:sz w:val="16"/>
-              </w:rPr>
-              <w:t>Code Python du DAG</w:t>
-            </w:r>
-          </w:p>
-        </w:tc>
-      </w:tr>
-    </w:tbl>
-    <w:p>
-      <w:pPr>
-        <w:rPr>
-          <w:lang w:val="fr-SN"/>
-        </w:rPr>
-      </w:pPr>
-      <w:r>
-        <w:rPr>
-          <w:lang w:val="fr-SN"/>
-        </w:rPr>
-        <w:t xml:space="preserve">Figure 10 : Implémentation technique du DAG </w:t>
-      </w:r>
-      <w:proofErr w:type="spellStart"/>
-      <w:r>
-        <w:rPr>
-          <w:lang w:val="fr-SN"/>
-        </w:rPr>
-        <w:t>MLOps</w:t>
-      </w:r>
-      <w:proofErr w:type="spellEnd"/>
-      <w:r>
-        <w:rPr>
-          <w:lang w:val="fr-SN"/>
-        </w:rPr>
-        <w:t xml:space="preserve"> (Détails de la détection de dérive).</w:t>
-      </w:r>
-    </w:p>
-    <w:p>
-      <w:pPr>
-        <w:pStyle w:val="Titre1"/>
-      </w:pPr>
-      <w:r>
-        <w:lastRenderedPageBreak/>
-        <w:t xml:space="preserve">9. DATA WAREHOUSING ET NOSQL (HIVE &amp; HBASE) </w:t>
-      </w:r>
-    </w:p>
-    <w:p>
-      <w:pPr>
-        <w:rPr>
-          <w:lang w:val="fr-SN"/>
-        </w:rPr>
-      </w:pPr>
-      <w:r>
-        <w:rPr>
-          <w:lang w:val="fr-SN"/>
-        </w:rPr>
-        <w:t xml:space="preserve">Pour les requêtes SQL complexes, nous utilisons </w:t>
-      </w:r>
-      <w:proofErr w:type="spellStart"/>
-      <w:r>
-        <w:rPr>
-          <w:lang w:val="fr-SN"/>
-        </w:rPr>
-        <w:t>Hive</w:t>
-      </w:r>
-      <w:proofErr w:type="spellEnd"/>
-      <w:r>
-        <w:rPr>
-          <w:lang w:val="fr-SN"/>
-        </w:rPr>
-        <w:t>. Pour les accès rapides et le monitoring, nous utilisons HBase.</w:t>
-      </w:r>
-    </w:p>
-    <w:tbl>
-      <w:tblPr>
-        <w:tblW w:w="0" w:type="auto"/>
-        <w:tblLook w:val="04A0" w:firstRow="1" w:lastRow="0" w:firstColumn="1" w:lastColumn="0" w:noHBand="0" w:noVBand="1"/>
-      </w:tblPr>
-      <w:tblGrid>
-        <w:gridCol w:w="5112"/>
-        <w:gridCol w:w="5112"/>
-      </w:tblGrid>
-      <w:tr>
-        <w:tc>
-          <w:tcPr>
-            <w:tcW w:w="5112" w:type="dxa"/>
-            <w:tcBorders>
-              <w:top w:val="nil"/>
-              <w:left w:val="nil"/>
-              <w:bottom w:val="nil"/>
-              <w:right w:val="nil"/>
-            </w:tcBorders>
-          </w:tcPr>
-          <w:p>
-            <w:pPr>
-              <w:rPr>
-                <w:lang w:val="fr-SN"/>
-              </w:rPr>
-            </w:pPr>
-            <w:r>
-              <w:rPr>
-                <w:lang w:val="fr-SN"/>
-              </w:rPr>
-              <w:t>Description technique de l'étape du pipeline Big Data ci-contre.</w:t>
-            </w:r>
-          </w:p>
-        </w:tc>
-        <w:tc>
-          <w:tcPr>
-            <w:tcW w:w="5112" w:type="dxa"/>
-            <w:tcBorders>
-              <w:top w:val="nil"/>
-              <w:left w:val="nil"/>
-              <w:bottom w:val="nil"/>
-              <w:right w:val="nil"/>
-            </w:tcBorders>
-          </w:tcPr>
-          <w:p>
-            <w:pPr>
-              <w:jc w:val="center"/>
-            </w:pPr>
-            <w:r>
-              <w:rPr>
-                <w:noProof/>
-              </w:rPr>
-              <w:drawing>
-                <wp:inline distT="0" distB="0" distL="0" distR="0" wp14:anchorId="59E5D838" wp14:editId="61A4B129">
-                  <wp:extent cx="2926080" cy="2279087"/>
-                  <wp:effectExtent l="0" t="0" r="0" b="0"/>
-                  <wp:docPr id="12" name="Picture 12"/>
-                  <wp:cNvGraphicFramePr>
-                    <a:graphicFrameLocks xmlns:a="http://schemas.openxmlformats.org/drawingml/2006/main" noChangeAspect="1"/>
-                  </wp:cNvGraphicFramePr>
-                  <a:graphic xmlns:a="http://schemas.openxmlformats.org/drawingml/2006/main">
-                    <a:graphicData uri="http://schemas.openxmlformats.org/drawingml/2006/picture">
-                      <pic:pic xmlns:pic="http://schemas.openxmlformats.org/drawingml/2006/picture">
-                        <pic:nvPicPr>
-                          <pic:cNvPr id="0" name="hbase_master.png"/>
-                          <pic:cNvPicPr/>
-                        </pic:nvPicPr>
-                        <pic:blipFill>
-                          <a:blip r:embed="rId17"/>
-                          <a:stretch>
-                            <a:fillRect/>
-                          </a:stretch>
-                        </pic:blipFill>
-                        <pic:spPr>
-                          <a:xfrm>
-                            <a:off x="0" y="0"/>
-                            <a:ext cx="2926080" cy="2279087"/>
-                          </a:xfrm>
-                          <a:prstGeom prst="rect">
-                            <a:avLst/>
-                          </a:prstGeom>
-                        </pic:spPr>
-                      </pic:pic>
-                    </a:graphicData>
-                  </a:graphic>
-                </wp:inline>
-              </w:drawing>
-            </w:r>
-          </w:p>
-          <w:p>
-            <w:pPr>
-              <w:jc w:val="center"/>
-            </w:pPr>
-            <w:r>
-              <w:rPr>
-                <w:i/>
-                <w:sz w:val="16"/>
-              </w:rPr>
-              <w:t>HBase Master UI</w:t>
-            </w:r>
-          </w:p>
-        </w:tc>
-      </w:tr>
-    </w:tbl>
-    <w:p>
-      <w:pPr>
-        <w:rPr>
-          <w:lang w:val="fr-SN"/>
-        </w:rPr>
-      </w:pPr>
-      <w:r>
-        <w:rPr>
-          <w:lang w:val="fr-SN"/>
-        </w:rPr>
-        <w:t>Figure 11 : État du Master HBase et monitoring des tables de drift.</w:t>
-      </w:r>
-    </w:p>
-    <w:tbl>
-      <w:tblPr>
-        <w:tblW w:w="0" w:type="auto"/>
-        <w:tblLook w:val="04A0" w:firstRow="1" w:lastRow="0" w:firstColumn="1" w:lastColumn="0" w:noHBand="0" w:noVBand="1"/>
-      </w:tblPr>
-      <w:tblGrid>
-        <w:gridCol w:w="5112"/>
-        <w:gridCol w:w="5112"/>
-      </w:tblGrid>
-      <w:tr>
-        <w:tc>
-          <w:tcPr>
-            <w:tcW w:w="5112" w:type="dxa"/>
-            <w:tcBorders>
-              <w:top w:val="nil"/>
-              <w:left w:val="nil"/>
-              <w:bottom w:val="nil"/>
-              <w:right w:val="nil"/>
-            </w:tcBorders>
-          </w:tcPr>
-          <w:p>
-            <w:pPr>
-              <w:rPr>
-                <w:lang w:val="fr-SN"/>
-              </w:rPr>
-            </w:pPr>
-            <w:r>
-              <w:rPr>
-                <w:lang w:val="fr-SN"/>
-              </w:rPr>
-              <w:t>Description technique de l'étape du pipeline Big Data ci-contre.</w:t>
-            </w:r>
-          </w:p>
-        </w:tc>
-        <w:tc>
-          <w:tcPr>
-            <w:tcW w:w="5112" w:type="dxa"/>
-            <w:tcBorders>
-              <w:top w:val="nil"/>
-              <w:left w:val="nil"/>
-              <w:bottom w:val="nil"/>
-              <w:right w:val="nil"/>
-            </w:tcBorders>
-          </w:tcPr>
-          <w:p>
-            <w:pPr>
-              <w:jc w:val="center"/>
-            </w:pPr>
-            <w:r>
-              <w:rPr>
-                <w:noProof/>
-              </w:rPr>
-              <w:drawing>
-                <wp:inline distT="0" distB="0" distL="0" distR="0" wp14:anchorId="062D636A" wp14:editId="164B941B">
-                  <wp:extent cx="2926080" cy="3512772"/>
-                  <wp:effectExtent l="0" t="0" r="0" b="0"/>
-                  <wp:docPr id="13" name="Picture 13"/>
-                  <wp:cNvGraphicFramePr>
-                    <a:graphicFrameLocks xmlns:a="http://schemas.openxmlformats.org/drawingml/2006/main" noChangeAspect="1"/>
-                  </wp:cNvGraphicFramePr>
-                  <a:graphic xmlns:a="http://schemas.openxmlformats.org/drawingml/2006/main">
-                    <a:graphicData uri="http://schemas.openxmlformats.org/drawingml/2006/picture">
-                      <pic:pic xmlns:pic="http://schemas.openxmlformats.org/drawingml/2006/picture">
-                        <pic:nvPicPr>
-                          <pic:cNvPr id="0" name="hbase_logs.png"/>
-                          <pic:cNvPicPr/>
-                        </pic:nvPicPr>
-                        <pic:blipFill>
-                          <a:blip r:embed="rId18"/>
-                          <a:stretch>
-                            <a:fillRect/>
-                          </a:stretch>
-                        </pic:blipFill>
-                        <pic:spPr>
-                          <a:xfrm>
-                            <a:off x="0" y="0"/>
-                            <a:ext cx="2926080" cy="3512772"/>
-                          </a:xfrm>
-                          <a:prstGeom prst="rect">
-                            <a:avLst/>
-                          </a:prstGeom>
-                        </pic:spPr>
-                      </pic:pic>
-                    </a:graphicData>
-                  </a:graphic>
-                </wp:inline>
-              </w:drawing>
-            </w:r>
-          </w:p>
-          <w:p>
-            <w:pPr>
-              <w:jc w:val="center"/>
-            </w:pPr>
-            <w:r>
-              <w:rPr>
-                <w:i/>
-                <w:sz w:val="16"/>
-              </w:rPr>
-              <w:t>HBase Logs</w:t>
-            </w:r>
-          </w:p>
-        </w:tc>
-      </w:tr>
-    </w:tbl>
-    <w:p>
-      <w:pPr>
-        <w:rPr>
-          <w:lang w:val="fr-SN"/>
-        </w:rPr>
-      </w:pPr>
-      <w:r>
-        <w:rPr>
-          <w:lang w:val="fr-SN"/>
-        </w:rPr>
-        <w:t>Figure 12 : Consultation des journaux d'exécution du service HBase.</w:t>
-      </w:r>
-    </w:p>
-    <w:p>
-      <w:pPr>
-        <w:pStyle w:val="Titre1"/>
-        <w:rPr>
-          <w:lang w:val="fr-SN"/>
-        </w:rPr>
-      </w:pPr>
-      <w:r>
-        <w:rPr>
-          <w:lang w:val="fr-SN"/>
-        </w:rPr>
-        <w:t xml:space="preserve">10. VISUALISATION ET BUSINESS INTELLIGENCE </w:t>
-      </w:r>
-    </w:p>
-    <w:p>
-      <w:pPr>
-        <w:rPr>
-          <w:lang w:val="fr-SN"/>
-        </w:rPr>
-      </w:pPr>
-      <w:r>
-        <w:rPr>
-          <w:lang w:val="fr-SN"/>
-        </w:rPr>
-        <w:t xml:space="preserve">Le </w:t>
-      </w:r>
-      <w:proofErr w:type="spellStart"/>
-      <w:r>
-        <w:rPr>
-          <w:lang w:val="fr-SN"/>
-        </w:rPr>
-        <w:t>dashboard</w:t>
-      </w:r>
-      <w:proofErr w:type="spellEnd"/>
-      <w:r>
-        <w:rPr>
-          <w:lang w:val="fr-SN"/>
-        </w:rPr>
-        <w:t xml:space="preserve"> final consolide les prédictions pour offrir une aide à la décision aux acteurs agricoles.</w:t>
-      </w:r>
-    </w:p>
-    <w:tbl>
-      <w:tblPr>
-        <w:tblW w:w="0" w:type="auto"/>
-        <w:tblLook w:val="04A0" w:firstRow="1" w:lastRow="0" w:firstColumn="1" w:lastColumn="0" w:noHBand="0" w:noVBand="1"/>
-      </w:tblPr>
-      <w:tblGrid>
-        <w:gridCol w:w="5112"/>
-        <w:gridCol w:w="5112"/>
-      </w:tblGrid>
-      <w:tr>
-        <w:tc>
-          <w:tcPr>
-            <w:tcW w:w="5112" w:type="dxa"/>
-            <w:tcBorders>
-              <w:top w:val="nil"/>
-              <w:left w:val="nil"/>
-              <w:bottom w:val="nil"/>
-              <w:right w:val="nil"/>
-            </w:tcBorders>
-          </w:tcPr>
-          <w:p>
-            <w:pPr>
-              <w:rPr>
-                <w:lang w:val="fr-SN"/>
-              </w:rPr>
-            </w:pPr>
-            <w:r>
-              <w:rPr>
-                <w:lang w:val="fr-SN"/>
-              </w:rPr>
-              <w:lastRenderedPageBreak/>
-              <w:t>Description technique de l'étape du pipeline Big Data ci-contre.</w:t>
-            </w:r>
-          </w:p>
-        </w:tc>
-        <w:tc>
-          <w:tcPr>
-            <w:tcW w:w="5112" w:type="dxa"/>
-            <w:tcBorders>
-              <w:top w:val="nil"/>
-              <w:left w:val="nil"/>
-              <w:bottom w:val="nil"/>
-              <w:right w:val="nil"/>
-            </w:tcBorders>
-          </w:tcPr>
-          <w:p>
-            <w:pPr>
-              <w:jc w:val="center"/>
-            </w:pPr>
-            <w:r>
-              <w:rPr>
-                <w:noProof/>
-              </w:rPr>
-              <w:drawing>
-                <wp:inline distT="0" distB="0" distL="0" distR="0" wp14:anchorId="6C7D84EE" wp14:editId="26619659">
-                  <wp:extent cx="2926080" cy="2194560"/>
-                  <wp:effectExtent l="0" t="0" r="0" b="0"/>
-                  <wp:docPr id="14" name="Picture 14"/>
-                  <wp:cNvGraphicFramePr>
-                    <a:graphicFrameLocks xmlns:a="http://schemas.openxmlformats.org/drawingml/2006/main" noChangeAspect="1"/>
-                  </wp:cNvGraphicFramePr>
-                  <a:graphic xmlns:a="http://schemas.openxmlformats.org/drawingml/2006/main">
-                    <a:graphicData uri="http://schemas.openxmlformats.org/drawingml/2006/picture">
-                      <pic:pic xmlns:pic="http://schemas.openxmlformats.org/drawingml/2006/picture">
-                        <pic:nvPicPr>
-                          <pic:cNvPr id="0" name="dashboard_final.png"/>
-                          <pic:cNvPicPr/>
-                        </pic:nvPicPr>
-                        <pic:blipFill>
-                          <a:blip r:embed="rId19"/>
-                          <a:stretch>
-                            <a:fillRect/>
-                          </a:stretch>
-                        </pic:blipFill>
-                        <pic:spPr>
-                          <a:xfrm>
-                            <a:off x="0" y="0"/>
-                            <a:ext cx="2926080" cy="2194560"/>
-                          </a:xfrm>
-                          <a:prstGeom prst="rect">
-                            <a:avLst/>
-                          </a:prstGeom>
-                        </pic:spPr>
-                      </pic:pic>
-                    </a:graphicData>
-                  </a:graphic>
-                </wp:inline>
-              </w:drawing>
-            </w:r>
-          </w:p>
-          <w:p>
-            <w:pPr>
-              <w:jc w:val="center"/>
-            </w:pPr>
-            <w:r>
-              <w:rPr>
-                <w:i/>
-                <w:sz w:val="16"/>
+                <w:sz w:val="25"/>
               </w:rPr>
               <w:t>Dashboard Final</w:t>
             </w:r>
@@ -2549,12 +1934,14 @@
     </w:tbl>
     <w:p>
       <w:pPr>
+        <w:spacing w:before="240" w:after="240" w:line="276" w:lineRule="auto"/>
         <w:rPr>
           <w:lang w:val="fr-SN"/>
         </w:rPr>
       </w:pPr>
       <w:r>
         <w:rPr>
+          <w:sz w:val="25"/>
           <w:lang w:val="fr-SN"/>
         </w:rPr>
         <w:t>Figure 13 : Visualisation finale des rendements prédits et des indices de stress hydrique.</w:t>
@@ -2563,6 +1950,7 @@
     <w:p>
       <w:pPr>
         <w:pStyle w:val="Titre1"/>
+        <w:spacing w:before="240" w:after="240" w:line="276" w:lineRule="auto"/>
         <w:rPr>
           <w:lang w:val="fr-SN"/>
         </w:rPr>
@@ -2576,12 +1964,14 @@
     </w:p>
     <w:p>
       <w:pPr>
+        <w:spacing w:before="240" w:after="240" w:line="276" w:lineRule="auto"/>
         <w:rPr>
           <w:lang w:val="fr-SN"/>
         </w:rPr>
       </w:pPr>
       <w:r>
         <w:rPr>
+          <w:sz w:val="25"/>
           <w:lang w:val="fr-SN"/>
         </w:rPr>
         <w:t xml:space="preserve">Le projet Agri-Insight SN démontre la puissance du Big Data pour le développement agricole. L'utilisation combinée d'outils comme Spark, </w:t>
@@ -2589,6 +1979,7 @@
       <w:proofErr w:type="spellStart"/>
       <w:r>
         <w:rPr>
+          <w:sz w:val="25"/>
           <w:lang w:val="fr-SN"/>
         </w:rPr>
         <w:t>Airflow</w:t>
@@ -2596,6 +1987,7 @@
       <w:proofErr w:type="spellEnd"/>
       <w:r>
         <w:rPr>
+          <w:sz w:val="25"/>
           <w:lang w:val="fr-SN"/>
         </w:rPr>
         <w:t xml:space="preserve"> et </w:t>
@@ -2603,6 +1995,7 @@
       <w:proofErr w:type="spellStart"/>
       <w:r>
         <w:rPr>
+          <w:sz w:val="25"/>
           <w:lang w:val="fr-SN"/>
         </w:rPr>
         <w:t>NiFi</w:t>
@@ -2610,6 +2003,7 @@
       <w:proofErr w:type="spellEnd"/>
       <w:r>
         <w:rPr>
+          <w:sz w:val="25"/>
           <w:lang w:val="fr-SN"/>
         </w:rPr>
         <w:t xml:space="preserve"> permet de bâtir une plateforme robuste, scalable et prête pour la production.</w:t>
@@ -2617,12 +2011,14 @@
     </w:p>
     <w:p>
       <w:pPr>
+        <w:spacing w:before="240" w:after="240" w:line="276" w:lineRule="auto"/>
         <w:rPr>
           <w:lang w:val="fr-SN"/>
         </w:rPr>
       </w:pPr>
       <w:r>
         <w:rPr>
+          <w:sz w:val="25"/>
           <w:lang w:val="fr-SN"/>
         </w:rPr>
         <w:t>Perspectives :</w:t>
@@ -2630,12 +2026,14 @@
     </w:p>
     <w:p>
       <w:pPr>
+        <w:spacing w:before="240" w:after="240" w:line="276" w:lineRule="auto"/>
         <w:rPr>
           <w:lang w:val="fr-SN"/>
         </w:rPr>
       </w:pPr>
       <w:r>
         <w:rPr>
+          <w:sz w:val="25"/>
           <w:lang w:val="fr-SN"/>
         </w:rPr>
         <w:t>*   Intégration de données satellites.</w:t>
@@ -2643,12 +2041,14 @@
     </w:p>
     <w:p>
       <w:pPr>
+        <w:spacing w:before="240" w:after="240" w:line="276" w:lineRule="auto"/>
         <w:rPr>
           <w:lang w:val="fr-SN"/>
         </w:rPr>
       </w:pPr>
       <w:r>
         <w:rPr>
+          <w:sz w:val="25"/>
           <w:lang w:val="fr-SN"/>
         </w:rPr>
         <w:t xml:space="preserve">*   Déploiement sur un cluster </w:t>
@@ -2656,6 +2056,7 @@
       <w:proofErr w:type="spellStart"/>
       <w:r>
         <w:rPr>
+          <w:sz w:val="25"/>
           <w:lang w:val="fr-SN"/>
         </w:rPr>
         <w:t>Kubernetes</w:t>
@@ -2663,15 +2064,23 @@
       <w:proofErr w:type="spellEnd"/>
       <w:r>
         <w:rPr>
+          <w:sz w:val="25"/>
           <w:lang w:val="fr-SN"/>
         </w:rPr>
         <w:t>.</w:t>
       </w:r>
     </w:p>
-    <w:p/>
+    <w:p>
+      <w:pPr>
+        <w:spacing w:before="240" w:after="240" w:line="276" w:lineRule="auto"/>
+        <w:rPr>
+          <w:lang w:val="fr-SN"/>
+        </w:rPr>
+      </w:pPr>
+    </w:p>
     <w:sectPr>
       <w:pgSz w:w="12240" w:h="15840"/>
-      <w:pgMar w:top="720" w:right="1008" w:bottom="720" w:left="1008" w:header="720" w:footer="720" w:gutter="0"/>
+      <w:pgMar w:top="1440" w:right="1440" w:bottom="1440" w:left="1440" w:header="720" w:footer="720" w:gutter="0"/>
       <w:cols w:space="720"/>
       <w:docGrid w:linePitch="360"/>
     </w:sectPr>
@@ -3167,11 +2576,6 @@
     <w:lsdException w:name="Book Title" w:uiPriority="33" w:qFormat="1"/>
     <w:lsdException w:name="Bibliography" w:semiHidden="1" w:uiPriority="37" w:unhideWhenUsed="1"/>
     <w:lsdException w:name="TOC Heading" w:semiHidden="1" w:uiPriority="39" w:unhideWhenUsed="1" w:qFormat="1"/>
-    <w:lsdException w:name="Plain Table 5" w:semiHidden="1" w:unhideWhenUsed="1"/>
-    <w:lsdException w:name="Grid Table Light" w:semiHidden="1" w:unhideWhenUsed="1"/>
-    <w:lsdException w:name="Grid Table 1 Light" w:semiHidden="1" w:unhideWhenUsed="1"/>
-    <w:lsdException w:name="Grid Table 2" w:semiHidden="1" w:unhideWhenUsed="1"/>
-    <w:lsdException w:name="Grid Table 3" w:semiHidden="1" w:unhideWhenUsed="1"/>
     <w:lsdException w:name="Grid Table 4" w:uiPriority="49"/>
     <w:lsdException w:name="Grid Table 5 Dark" w:uiPriority="50"/>
     <w:lsdException w:name="Grid Table 6 Colorful" w:uiPriority="51"/>

</xml_diff>